<commit_message>
Integrate all new findings into the Word report
Adds: Section 3.8 (training-variance follow-up), Section 4.9 (RLS
follow-up, with table and figures), the LMS-vs-NLMS root-cause into Section
6.4, the CNN high-SNR-floor root-cause into Section 3.7, and updates the
Executive Summary, Objective, Conclusions, Named Future Work, and Appendix
(test count, new experiment/module files) to match report.md. Structurally
verified: 11 tables (+1), 18 images (+3), all new headings present in order.
</commit_message>
<xml_diff>
--- a/report/SDR_Denoising_Project_Report.docx
+++ b/report/SDR_Denoising_Project_Report.docx
@@ -196,7 +196,7 @@
                 <w:color w:val="555555"/>
                 <w:sz w:val="18"/>
               </w:rPr>
-              <w:t>35-test regression suite · 4 real bugs found, root-caused, and fixed (Section 4.2, 6.2)</w:t>
+              <w:t>51-test regression suite (CI-enforced) · 5 real bugs found, root-caused, and fixed (Section 4.2, 6.2, 4.9)</w:t>
             </w:r>
           </w:p>
         </w:tc>
@@ -354,7 +354,7 @@
           <w:i w:val="0"/>
           <w:sz w:val="22"/>
         </w:rPr>
-        <w:t>This project compares four denoising/equalization approaches — LMS, NLMS, a 1-D CNN autoencoder, and a Hybrid LMS→CNN cascade — against a No-Processing baseline, for BPSK, QPSK, and 16-QAM signals from -10dB to +30dB SNR. What began as two controlled case studies grew, through follow-up questions each result raised, into four case studies plus three connecting analyses — every addition was triggered by a specific gap or untested claim the previous result left open, not added for its own sake.</w:t>
+        <w:t>This project compares five denoising/equalization approaches — LMS, NLMS, RLS, a 1-D CNN autoencoder, and a Hybrid LMS→CNN cascade — against a No-Processing baseline, for BPSK, QPSK, and 16-QAM signals from -10dB to +30dB SNR. What began as two controlled case studies grew, through follow-up questions each result raised, into four case studies plus several connecting analyses and diagnostics — every addition was triggered by a specific gap or untested claim the previous result left open, not added for its own sake.</w:t>
       </w:r>
     </w:p>
     <w:p>
@@ -449,6 +449,38 @@
       </w:pPr>
       <w:r>
         <w:t>A compute-cost analysis found CNN needs ~106-212x more arithmetic per sample than LMS/NLMS, yet is paradoxically faster in wall-clock terms on this project's CPU stack — a finding about implementation efficiency, not algorithmic cost, with a concrete hardware-deployment answer either way.</w:t>
+      </w:r>
+    </w:p>
+    <w:p>
+      <w:pPr>
+        <w:pStyle w:val="ListNumber"/>
+      </w:pPr>
+      <w:r>
+        <w:t>The LMS-vs-NLMS decision-directed asymmetry from Case Study 3 was root-caused, not left as a hypothesis: NLMS's instantaneous-power step-size normalization measurably inflates its effective step size during channel fades (confirmed in 15/15 engaged trials), while LMS's fixed step size does the opposite (16/16 trials) — a real, 100%-consistent mechanism.</w:t>
+      </w:r>
+    </w:p>
+    <w:p>
+      <w:pPr>
+        <w:pStyle w:val="ListNumber"/>
+      </w:pPr>
+      <w:r>
+        <w:t>The high-SNR CNN error floor was also root-caused: a window/overlap-add reconstruction artifact, confirmed via an 81.1% same-position overlap between loss functions and a statistically significant (χ²=168.0, p=3.5×10⁻³⁶) clustering by window phase — ruling out "unfixable noise" as the primary cause.</w:t>
+      </w:r>
+    </w:p>
+    <w:p>
+      <w:pPr>
+        <w:pStyle w:val="ListNumber"/>
+      </w:pPr>
+      <w:r>
+        <w:t>Training the CNN once per case study (rather than across several seeds) was validated, not just assumed: training-draw variance is consistently smaller than test-time Monte Carlo variance across every condition tested.</w:t>
+      </w:r>
+    </w:p>
+    <w:p>
+      <w:pPr>
+        <w:pStyle w:val="ListNumber"/>
+      </w:pPr>
+      <w:r>
+        <w:t>RLS, added as a third classical baseline after fixing a real safety bug (an unguarded decision-directed default), produced a genuinely nuanced result: worse than LMS/NLMS at low-to-moderate SNR, but strictly better at high SNR — not the simple "RLS always wins" result its theoretical motivation alone would predict.</w:t>
       </w:r>
     </w:p>
     <w:p>
@@ -1097,7 +1129,7 @@
           <w:i w:val="0"/>
           <w:sz w:val="22"/>
         </w:rPr>
-        <w:t>Compare four denoising/equalization approaches against a No-Processing baseline, for BPSK, QPSK, and 16-QAM signals corrupted by AWGN, multipath ISI, and (in one follow-up) time-varying fading. The project is organized as four case studies plus three connecting analyses, each generated directly by a gap or unverified claim in a previous result:</w:t>
+        <w:t>Compare five denoising/equalization approaches against a No-Processing baseline, for BPSK, QPSK, and 16-QAM signals corrupted by AWGN, multipath ISI, and (in one follow-up) time-varying fading. The project is organized as four case studies plus several connecting analyses and diagnostics, each generated directly by a gap or unverified claim in a previous result:</w:t>
       </w:r>
     </w:p>
     <w:p>
@@ -1113,7 +1145,7 @@
         <w:pStyle w:val="ListBullet"/>
       </w:pPr>
       <w:r>
-        <w:t>Case Study 2 (Section 4): the same methods, unchanged, on a channel with real ISI (RRC pulse shaping at 4x oversampling + a static multipath channel), plus a genie-aided MMSE equalizer.</w:t>
+        <w:t>Case Study 2 (Section 4): the same methods, unchanged, on a channel with real ISI (RRC pulse shaping at 4x oversampling + a static multipath channel), plus a genie-aided MMSE equalizer and, as a follow-up, RLS as a third classical baseline (Section 4.9).</w:t>
       </w:r>
     </w:p>
     <w:p>
@@ -1129,7 +1161,7 @@
         <w:pStyle w:val="ListBullet"/>
       </w:pPr>
       <w:r>
-        <w:t>Case Study 3 (Section 6): a genuinely time-varying channel, testing whether freezing LMS/NLMS after the preamble is still the right call once the channel actually moves.</w:t>
+        <w:t>Case Study 3 (Section 6): a genuinely time-varying channel, testing whether freezing LMS/NLMS after the preamble is still the right call once the channel actually moves, and root-causing why LMS benefits from tracking while NLMS does not.</w:t>
       </w:r>
     </w:p>
     <w:p>
@@ -1145,7 +1177,7 @@
         <w:pStyle w:val="ListBullet"/>
       </w:pPr>
       <w:r>
-        <w:t>Boundary-Aware Loss (Section 3.7): turns Case Study 1's diagnosis of why CNN loses to No-Processing into a tested, partially-confirmed causal claim.</w:t>
+        <w:t>Boundary-Aware Loss and Training-Variance (Sections 3.7-3.8): turns Case Study 1's diagnosis of why CNN loses to No-Processing into a tested, partially-confirmed causal claim, root-causes the resulting high-SNR error floor, and quantifies how much training randomness (vs. test-time randomness) contributes to reported BER variance.</w:t>
       </w:r>
     </w:p>
     <w:p>
@@ -6452,6 +6484,91 @@
           <w:sz w:val="22"/>
         </w:rPr>
         <w:t>A bit-level flip diagnostic confirms this is mechanistic: at QPSK -10dB, MSE's harmful/beneficial flip counts are 14,683/12,611 (net harm 2,072); Hinge's are 6,037/5,592 (net harm 445) — both counts roughly halve under the boundary-aware loss, exactly the predicted effect. The predicted trade-off is also confirmed: Hinge has systematically lower output SNR than MSE (e.g. QPSK 15dB: 18.04dB vs 21.28dB) — it genuinely trades accuracy for margin, and that only pays off where boundary ambiguity, not some other structural error source, dominates. Full detail: report/findings_boundary_aware_loss.md.</w:t>
+      </w:r>
+    </w:p>
+    <w:p>
+      <w:pPr>
+        <w:spacing w:before="120" w:after="120"/>
+        <w:ind w:left="360"/>
+        <w:shd w:fill="EFEFEF"/>
+        <w:pBdr>
+          <w:left w:val="single" w:sz="24" w:color="B02A2A" w:space="4"/>
+        </w:pBdr>
+      </w:pPr>
+      <w:r>
+        <w:rPr>
+          <w:b/>
+          <w:sz w:val="22"/>
+        </w:rPr>
+        <w:t>Root-caused since: the loss-independent high-SNR floor is the CNN's window/overlap-add reconstruction — 81.1% same-position overlap between MSE and Hinge, a statistically significant (χ²=168.0, p=3.5×10⁻³⁶) non-uniform clustering by window phase, and only 15.1% overlap with No-Processing's own errors (ruling out "unfixable noise").</w:t>
+      </w:r>
+    </w:p>
+    <w:p>
+      <w:pPr>
+        <w:jc w:val="both"/>
+      </w:pPr>
+      <w:r>
+        <w:rPr>
+          <w:b w:val="0"/>
+          <w:i w:val="0"/>
+          <w:sz w:val="22"/>
+        </w:rPr>
+        <w:t>Position-level tracking of every floor error (`report/findings_cnn_high_snr_floor.md`) found: (1) MSE and Hinge fail at the same symbol position 81.1% of the time (98.8-100% for BPSK) — far beyond chance given how sparse these errors are; (2) those positions cluster non-uniformly within the window-overlap cycle (symbol_index mod 64), declining monotonically from window-start to window-end (317/306/205/75 across four quartiles), confirmed against the uniform null by a chi-square test; (3) only 15.1% of these positions were also wrong for No-Processing's raw hard-decision — 84.9% of the time the CNN introduces a new error rather than failing on an already-lost sample; (4) noise magnitude at these positions is only mildly elevated (1.39-1.64x typical), not the large outlier a "structurally hard sample" explanation would predict. Together this confirms a genuine, loss-independent, position-dependent reconstruction weak spot, not unfixable noise.</w:t>
+      </w:r>
+    </w:p>
+    <w:p>
+      <w:pPr>
+        <w:pStyle w:val="Heading2"/>
+        <w:keepNext/>
+      </w:pPr>
+      <w:r>
+        <w:rPr>
+          <w:color w:val="1F3A5F"/>
+        </w:rPr>
+        <w:t>3.8 Follow-Up: Is Training the CNN Once Enough?</w:t>
+      </w:r>
+    </w:p>
+    <w:p>
+      <w:pPr>
+        <w:jc w:val="both"/>
+      </w:pPr>
+      <w:r>
+        <w:rPr>
+          <w:b w:val="0"/>
+          <w:i w:val="0"/>
+          <w:sz w:val="22"/>
+        </w:rPr>
+        <w:t>This project's practice (every case study) is to train each CNN/Hybrid model exactly once per modulation, then report Monte Carlo variance across test-time noise/bit-sequence draws only. The variance contributed by the training draw itself was previously unmeasured.</w:t>
+      </w:r>
+    </w:p>
+    <w:p>
+      <w:pPr>
+        <w:spacing w:before="120" w:after="120"/>
+        <w:ind w:left="360"/>
+        <w:shd w:fill="EFEFEF"/>
+        <w:pBdr>
+          <w:left w:val="single" w:sz="24" w:color="B02A2A" w:space="4"/>
+        </w:pBdr>
+      </w:pPr>
+      <w:r>
+        <w:rPr>
+          <w:b/>
+          <w:sz w:val="22"/>
+        </w:rPr>
+        <w:t>5 independently-seeded CNNs, evaluated on identical test data, show training-draw variance is consistently smaller than test-time variance across all 4 conditions tested (ratio 0.00-0.32x) — this project's practice of training once is justified, not an underestimate of true uncertainty.</w:t>
+      </w:r>
+    </w:p>
+    <w:p>
+      <w:pPr>
+        <w:jc w:val="both"/>
+      </w:pPr>
+      <w:r>
+        <w:rPr>
+          <w:b w:val="0"/>
+          <w:i w:val="0"/>
+          <w:sz w:val="22"/>
+        </w:rPr>
+        <w:t>At 15dB, five independently-trained BPSK models produced the exact same mean BER to 6 decimal places; QPSK's five were within 3% of each other. At 0dB (noisier), the ratio is largest (0.32x for QPSK) but still well under 1. This is also consistent with the high-SNR floor being a structural, architecture-driven property (Section 3.7) rather than something training randomness could shift. Full detail: report/findings_training_variance.md.</w:t>
       </w:r>
     </w:p>
     <w:p>
@@ -12902,6 +13019,577 @@
     </w:p>
     <w:p>
       <w:pPr>
+        <w:pStyle w:val="Heading2"/>
+        <w:keepNext/>
+      </w:pPr>
+      <w:r>
+        <w:rPr>
+          <w:color w:val="1F3A5F"/>
+        </w:rPr>
+        <w:t>4.9 Follow-Up: RLS as a Third Classical Baseline</w:t>
+      </w:r>
+    </w:p>
+    <w:p>
+      <w:pPr>
+        <w:jc w:val="both"/>
+      </w:pPr>
+      <w:r>
+        <w:rPr>
+          <w:b w:val="0"/>
+          <w:i w:val="0"/>
+          <w:sz w:val="22"/>
+        </w:rPr>
+        <w:t>RLS was originally excluded from Case Study 2 to keep exactly one variable (the channel) different from Case Study 1. Before this first real use, src/rls_filter.py — implemented but unused — needed a real safety fix: it defaulted to unguarded decision-directed continuation, the same broken |d-y|-threshold pattern already fixed for LMS/NLMS (Section 3.2). Hardened to frozen-by-default first (16 new regression tests), then run at Case Study 2's full scale.</w:t>
+      </w:r>
+    </w:p>
+    <w:p>
+      <w:pPr>
+        <w:spacing w:before="120" w:after="120"/>
+        <w:ind w:left="360"/>
+        <w:shd w:fill="EFEFEF"/>
+        <w:pBdr>
+          <w:left w:val="single" w:sz="24" w:color="B02A2A" w:space="4"/>
+        </w:pBdr>
+      </w:pPr>
+      <w:r>
+        <w:rPr>
+          <w:b/>
+          <w:sz w:val="22"/>
+        </w:rPr>
+        <w:t>Not the simple "RLS wins" result the future-work rationale predicted: RLS is measurably WORSE than LMS/NLMS at low-to-moderate SNR (5-19% more errors) but strictly BETTER at high SNR (zero errors at 15-20dB where LMS/NLMS retain a residual floor).</w:t>
+      </w:r>
+    </w:p>
+    <w:p>
+      <w:pPr>
+        <w:pStyle w:val="Caption"/>
+        <w:jc w:val="center"/>
+      </w:pPr>
+      <w:r>
+        <w:rPr>
+          <w:i/>
+          <w:color w:val="555555"/>
+          <w:sz w:val="18"/>
+        </w:rPr>
+        <w:t xml:space="preserve">Table </w:t>
+        <w:fldChar w:fldCharType="begin"/>
+        <w:instrText xml:space="preserve"> SEQ Table \* ARABIC </w:instrText>
+        <w:fldChar w:fldCharType="separate">
+          <w:t>#</w:t>
+        </w:fldChar>
+        <w:fldChar w:fldCharType="end"/>
+      </w:r>
+      <w:r>
+        <w:rPr>
+          <w:i/>
+          <w:color w:val="555555"/>
+          <w:sz w:val="18"/>
+        </w:rPr>
+        <w:t>: BER ratio (LMS or NLMS BER / RLS BER, &gt;1 = RLS wins) by SNR</w:t>
+      </w:r>
+    </w:p>
+    <w:tbl>
+      <w:tblPr>
+        <w:tblStyle w:val="LightGrid-Accent1"/>
+        <w:tblW w:type="auto" w:w="0"/>
+        <w:jc w:val="center"/>
+        <w:tblLook w:firstColumn="1" w:firstRow="1" w:lastColumn="0" w:lastRow="0" w:noHBand="0" w:noVBand="1" w:val="04A0"/>
+      </w:tblPr>
+      <w:tblGrid>
+        <w:gridCol w:w="1872"/>
+        <w:gridCol w:w="1872"/>
+        <w:gridCol w:w="1872"/>
+        <w:gridCol w:w="1872"/>
+        <w:gridCol w:w="1872"/>
+      </w:tblGrid>
+      <w:tr>
+        <w:tc>
+          <w:tcPr>
+            <w:tcW w:type="dxa" w:w="1872"/>
+          </w:tcPr>
+          <w:p>
+            <w:pPr>
+              <w:jc w:val="center"/>
+            </w:pPr>
+            <w:r>
+              <w:rPr>
+                <w:b/>
+                <w:sz w:val="18"/>
+              </w:rPr>
+              <w:t>SNR (dB)</w:t>
+            </w:r>
+          </w:p>
+        </w:tc>
+        <w:tc>
+          <w:tcPr>
+            <w:tcW w:type="dxa" w:w="1872"/>
+          </w:tcPr>
+          <w:p>
+            <w:pPr>
+              <w:jc w:val="center"/>
+            </w:pPr>
+            <w:r>
+              <w:rPr>
+                <w:b/>
+                <w:sz w:val="18"/>
+              </w:rPr>
+              <w:t>BPSK: LMS/RLS</w:t>
+            </w:r>
+          </w:p>
+        </w:tc>
+        <w:tc>
+          <w:tcPr>
+            <w:tcW w:type="dxa" w:w="1872"/>
+          </w:tcPr>
+          <w:p>
+            <w:pPr>
+              <w:jc w:val="center"/>
+            </w:pPr>
+            <w:r>
+              <w:rPr>
+                <w:b/>
+                <w:sz w:val="18"/>
+              </w:rPr>
+              <w:t>BPSK: NLMS/RLS</w:t>
+            </w:r>
+          </w:p>
+        </w:tc>
+        <w:tc>
+          <w:tcPr>
+            <w:tcW w:type="dxa" w:w="1872"/>
+          </w:tcPr>
+          <w:p>
+            <w:pPr>
+              <w:jc w:val="center"/>
+            </w:pPr>
+            <w:r>
+              <w:rPr>
+                <w:b/>
+                <w:sz w:val="18"/>
+              </w:rPr>
+              <w:t>QPSK: LMS/RLS</w:t>
+            </w:r>
+          </w:p>
+        </w:tc>
+        <w:tc>
+          <w:tcPr>
+            <w:tcW w:type="dxa" w:w="1872"/>
+          </w:tcPr>
+          <w:p>
+            <w:pPr>
+              <w:jc w:val="center"/>
+            </w:pPr>
+            <w:r>
+              <w:rPr>
+                <w:b/>
+                <w:sz w:val="18"/>
+              </w:rPr>
+              <w:t>QPSK: NLMS/RLS</w:t>
+            </w:r>
+          </w:p>
+        </w:tc>
+      </w:tr>
+      <w:tr>
+        <w:tc>
+          <w:tcPr>
+            <w:tcW w:type="dxa" w:w="1872"/>
+          </w:tcPr>
+          <w:p>
+            <w:pPr>
+              <w:jc w:val="center"/>
+            </w:pPr>
+            <w:r>
+              <w:rPr>
+                <w:sz w:val="18"/>
+              </w:rPr>
+              <w:t>-10 to 5</w:t>
+            </w:r>
+          </w:p>
+        </w:tc>
+        <w:tc>
+          <w:tcPr>
+            <w:tcW w:type="dxa" w:w="1872"/>
+          </w:tcPr>
+          <w:p>
+            <w:pPr>
+              <w:jc w:val="center"/>
+            </w:pPr>
+            <w:r>
+              <w:rPr>
+                <w:sz w:val="18"/>
+              </w:rPr>
+              <w:t>0.85-0.92x (RLS worse)</w:t>
+            </w:r>
+          </w:p>
+        </w:tc>
+        <w:tc>
+          <w:tcPr>
+            <w:tcW w:type="dxa" w:w="1872"/>
+          </w:tcPr>
+          <w:p>
+            <w:pPr>
+              <w:jc w:val="center"/>
+            </w:pPr>
+            <w:r>
+              <w:rPr>
+                <w:sz w:val="18"/>
+              </w:rPr>
+              <w:t>0.85-0.95x (RLS worse)</w:t>
+            </w:r>
+          </w:p>
+        </w:tc>
+        <w:tc>
+          <w:tcPr>
+            <w:tcW w:type="dxa" w:w="1872"/>
+          </w:tcPr>
+          <w:p>
+            <w:pPr>
+              <w:jc w:val="center"/>
+            </w:pPr>
+            <w:r>
+              <w:rPr>
+                <w:sz w:val="18"/>
+              </w:rPr>
+              <w:t>0.88-0.91x (RLS worse)</w:t>
+            </w:r>
+          </w:p>
+        </w:tc>
+        <w:tc>
+          <w:tcPr>
+            <w:tcW w:type="dxa" w:w="1872"/>
+          </w:tcPr>
+          <w:p>
+            <w:pPr>
+              <w:jc w:val="center"/>
+            </w:pPr>
+            <w:r>
+              <w:rPr>
+                <w:sz w:val="18"/>
+              </w:rPr>
+              <w:t>0.89-0.92x (RLS worse)</w:t>
+            </w:r>
+          </w:p>
+        </w:tc>
+      </w:tr>
+      <w:tr>
+        <w:tc>
+          <w:tcPr>
+            <w:tcW w:type="dxa" w:w="1872"/>
+          </w:tcPr>
+          <w:p>
+            <w:pPr>
+              <w:jc w:val="center"/>
+            </w:pPr>
+            <w:r>
+              <w:rPr>
+                <w:sz w:val="18"/>
+              </w:rPr>
+              <w:t>10</w:t>
+            </w:r>
+          </w:p>
+        </w:tc>
+        <w:tc>
+          <w:tcPr>
+            <w:tcW w:type="dxa" w:w="1872"/>
+          </w:tcPr>
+          <w:p>
+            <w:pPr>
+              <w:jc w:val="center"/>
+            </w:pPr>
+            <w:r>
+              <w:rPr>
+                <w:sz w:val="18"/>
+              </w:rPr>
+              <w:t>1.27x (RLS wins)</w:t>
+            </w:r>
+          </w:p>
+        </w:tc>
+        <w:tc>
+          <w:tcPr>
+            <w:tcW w:type="dxa" w:w="1872"/>
+          </w:tcPr>
+          <w:p>
+            <w:pPr>
+              <w:jc w:val="center"/>
+            </w:pPr>
+            <w:r>
+              <w:rPr>
+                <w:sz w:val="18"/>
+              </w:rPr>
+              <w:t>1.54x (RLS wins)</w:t>
+            </w:r>
+          </w:p>
+        </w:tc>
+        <w:tc>
+          <w:tcPr>
+            <w:tcW w:type="dxa" w:w="1872"/>
+          </w:tcPr>
+          <w:p>
+            <w:pPr>
+              <w:jc w:val="center"/>
+            </w:pPr>
+            <w:r>
+              <w:rPr>
+                <w:sz w:val="18"/>
+              </w:rPr>
+              <w:t>0.84x (RLS still worse)</w:t>
+            </w:r>
+          </w:p>
+        </w:tc>
+        <w:tc>
+          <w:tcPr>
+            <w:tcW w:type="dxa" w:w="1872"/>
+          </w:tcPr>
+          <w:p>
+            <w:pPr>
+              <w:jc w:val="center"/>
+            </w:pPr>
+            <w:r>
+              <w:rPr>
+                <w:sz w:val="18"/>
+              </w:rPr>
+              <w:t>0.90x (RLS still worse)</w:t>
+            </w:r>
+          </w:p>
+        </w:tc>
+      </w:tr>
+      <w:tr>
+        <w:tc>
+          <w:tcPr>
+            <w:tcW w:type="dxa" w:w="1872"/>
+          </w:tcPr>
+          <w:p>
+            <w:pPr>
+              <w:jc w:val="center"/>
+            </w:pPr>
+            <w:r>
+              <w:rPr>
+                <w:sz w:val="18"/>
+              </w:rPr>
+              <w:t>15-20</w:t>
+            </w:r>
+          </w:p>
+        </w:tc>
+        <w:tc>
+          <w:tcPr>
+            <w:tcW w:type="dxa" w:w="1872"/>
+          </w:tcPr>
+          <w:p>
+            <w:pPr>
+              <w:jc w:val="center"/>
+            </w:pPr>
+            <w:r>
+              <w:rPr>
+                <w:sz w:val="18"/>
+              </w:rPr>
+              <w:t>inf (RLS: 0 err)</w:t>
+            </w:r>
+          </w:p>
+        </w:tc>
+        <w:tc>
+          <w:tcPr>
+            <w:tcW w:type="dxa" w:w="1872"/>
+          </w:tcPr>
+          <w:p>
+            <w:pPr>
+              <w:jc w:val="center"/>
+            </w:pPr>
+            <w:r>
+              <w:rPr>
+                <w:sz w:val="18"/>
+              </w:rPr>
+              <w:t>inf (RLS: 0 err)</w:t>
+            </w:r>
+          </w:p>
+        </w:tc>
+        <w:tc>
+          <w:tcPr>
+            <w:tcW w:type="dxa" w:w="1872"/>
+          </w:tcPr>
+          <w:p>
+            <w:pPr>
+              <w:jc w:val="center"/>
+            </w:pPr>
+            <w:r>
+              <w:rPr>
+                <w:sz w:val="18"/>
+              </w:rPr>
+              <w:t>inf (RLS: 0 err)</w:t>
+            </w:r>
+          </w:p>
+        </w:tc>
+        <w:tc>
+          <w:tcPr>
+            <w:tcW w:type="dxa" w:w="1872"/>
+          </w:tcPr>
+          <w:p>
+            <w:pPr>
+              <w:jc w:val="center"/>
+            </w:pPr>
+            <w:r>
+              <w:rPr>
+                <w:sz w:val="18"/>
+              </w:rPr>
+              <w:t>inf (RLS: 0 err)</w:t>
+            </w:r>
+          </w:p>
+        </w:tc>
+      </w:tr>
+    </w:tbl>
+    <w:p/>
+    <w:p>
+      <w:pPr>
+        <w:jc w:val="both"/>
+      </w:pPr>
+      <w:r>
+        <w:rPr>
+          <w:b w:val="0"/>
+          <w:i w:val="0"/>
+          <w:sz w:val="22"/>
+        </w:rPr>
+        <w:t>A plausible (not verified) explanation: LMS/NLMS were extensively hardened for low-SNR stability (clamped step size, Polyak/Ruppert tail-averaging), while RLSFilter has no equivalent tail-averaging and an untuned λ=0.99 — a per-SNR-tuned forgetting factor is the natural next step, named rather than chased down further. RLS is also cheaper per-sample than NLMS in this implementation despite its higher algorithmic complexity, another instance of Section 8's compute-vs-wall-clock finding. Full detail: report/findings_rls_comparison.md.</w:t>
+      </w:r>
+    </w:p>
+    <w:p>
+      <w:pPr>
+        <w:jc w:val="center"/>
+      </w:pPr>
+      <w:r>
+        <w:drawing>
+          <wp:inline xmlns:a="http://schemas.openxmlformats.org/drawingml/2006/main" xmlns:pic="http://schemas.openxmlformats.org/drawingml/2006/picture">
+            <wp:extent cx="5303520" cy="3314700"/>
+            <wp:docPr id="9" name="Picture 9"/>
+            <wp:cNvGraphicFramePr>
+              <a:graphicFrameLocks noChangeAspect="1"/>
+            </wp:cNvGraphicFramePr>
+            <a:graphic>
+              <a:graphicData uri="http://schemas.openxmlformats.org/drawingml/2006/picture">
+                <pic:pic>
+                  <pic:nvPicPr>
+                    <pic:cNvPr id="0" name="ber_vs_snr_BPSK.png"/>
+                    <pic:cNvPicPr/>
+                  </pic:nvPicPr>
+                  <pic:blipFill>
+                    <a:blip r:embed="rId19"/>
+                    <a:stretch>
+                      <a:fillRect/>
+                    </a:stretch>
+                  </pic:blipFill>
+                  <pic:spPr>
+                    <a:xfrm>
+                      <a:off x="0" y="0"/>
+                      <a:ext cx="5303520" cy="3314700"/>
+                    </a:xfrm>
+                    <a:prstGeom prst="rect"/>
+                  </pic:spPr>
+                </pic:pic>
+              </a:graphicData>
+            </a:graphic>
+          </wp:inline>
+        </w:drawing>
+      </w:r>
+    </w:p>
+    <w:p>
+      <w:pPr>
+        <w:pStyle w:val="Caption"/>
+        <w:jc w:val="center"/>
+      </w:pPr>
+      <w:r>
+        <w:rPr>
+          <w:i/>
+          <w:color w:val="555555"/>
+          <w:sz w:val="18"/>
+        </w:rPr>
+        <w:t xml:space="preserve">Figure </w:t>
+        <w:fldChar w:fldCharType="begin"/>
+        <w:instrText xml:space="preserve"> SEQ Figure \* ARABIC </w:instrText>
+        <w:fldChar w:fldCharType="separate">
+          <w:t>#</w:t>
+        </w:fldChar>
+        <w:fldChar w:fldCharType="end"/>
+      </w:r>
+      <w:r>
+        <w:rPr>
+          <w:i/>
+          <w:color w:val="555555"/>
+          <w:sz w:val="18"/>
+        </w:rPr>
+        <w:t>: BER vs Input SNR incl. RLS, BPSK</w:t>
+      </w:r>
+    </w:p>
+    <w:p>
+      <w:pPr>
+        <w:jc w:val="center"/>
+      </w:pPr>
+      <w:r>
+        <w:drawing>
+          <wp:inline xmlns:a="http://schemas.openxmlformats.org/drawingml/2006/main" xmlns:pic="http://schemas.openxmlformats.org/drawingml/2006/picture">
+            <wp:extent cx="5303520" cy="3314700"/>
+            <wp:docPr id="10" name="Picture 10"/>
+            <wp:cNvGraphicFramePr>
+              <a:graphicFrameLocks noChangeAspect="1"/>
+            </wp:cNvGraphicFramePr>
+            <a:graphic>
+              <a:graphicData uri="http://schemas.openxmlformats.org/drawingml/2006/picture">
+                <pic:pic>
+                  <pic:nvPicPr>
+                    <pic:cNvPr id="0" name="ber_vs_snr_QPSK.png"/>
+                    <pic:cNvPicPr/>
+                  </pic:nvPicPr>
+                  <pic:blipFill>
+                    <a:blip r:embed="rId20"/>
+                    <a:stretch>
+                      <a:fillRect/>
+                    </a:stretch>
+                  </pic:blipFill>
+                  <pic:spPr>
+                    <a:xfrm>
+                      <a:off x="0" y="0"/>
+                      <a:ext cx="5303520" cy="3314700"/>
+                    </a:xfrm>
+                    <a:prstGeom prst="rect"/>
+                  </pic:spPr>
+                </pic:pic>
+              </a:graphicData>
+            </a:graphic>
+          </wp:inline>
+        </w:drawing>
+      </w:r>
+    </w:p>
+    <w:p>
+      <w:pPr>
+        <w:pStyle w:val="Caption"/>
+        <w:jc w:val="center"/>
+      </w:pPr>
+      <w:r>
+        <w:rPr>
+          <w:i/>
+          <w:color w:val="555555"/>
+          <w:sz w:val="18"/>
+        </w:rPr>
+        <w:t xml:space="preserve">Figure </w:t>
+        <w:fldChar w:fldCharType="begin"/>
+        <w:instrText xml:space="preserve"> SEQ Figure \* ARABIC </w:instrText>
+        <w:fldChar w:fldCharType="separate">
+          <w:t>#</w:t>
+        </w:fldChar>
+        <w:fldChar w:fldCharType="end"/>
+      </w:r>
+      <w:r>
+        <w:rPr>
+          <w:i/>
+          <w:color w:val="555555"/>
+          <w:sz w:val="18"/>
+        </w:rPr>
+        <w:t>: BER vs Input SNR incl. RLS, QPSK</w:t>
+      </w:r>
+    </w:p>
+    <w:p>
+      <w:r>
+        <w:br w:type="page"/>
+      </w:r>
+    </w:p>
+    <w:p>
+      <w:pPr>
         <w:pStyle w:val="Heading1"/>
         <w:keepNext/>
       </w:pPr>
@@ -13818,7 +14506,7 @@
         <w:drawing>
           <wp:inline xmlns:a="http://schemas.openxmlformats.org/drawingml/2006/main" xmlns:pic="http://schemas.openxmlformats.org/drawingml/2006/picture">
             <wp:extent cx="5303520" cy="2209800"/>
-            <wp:docPr id="9" name="Picture 9"/>
+            <wp:docPr id="11" name="Picture 11"/>
             <wp:cNvGraphicFramePr>
               <a:graphicFrameLocks noChangeAspect="1"/>
             </wp:cNvGraphicFramePr>
@@ -13830,7 +14518,7 @@
                     <pic:cNvPicPr/>
                   </pic:nvPicPr>
                   <pic:blipFill>
-                    <a:blip r:embed="rId19"/>
+                    <a:blip r:embed="rId21"/>
                     <a:stretch>
                       <a:fillRect/>
                     </a:stretch>
@@ -13885,7 +14573,7 @@
         <w:drawing>
           <wp:inline xmlns:a="http://schemas.openxmlformats.org/drawingml/2006/main" xmlns:pic="http://schemas.openxmlformats.org/drawingml/2006/picture">
             <wp:extent cx="5303520" cy="2209800"/>
-            <wp:docPr id="10" name="Picture 10"/>
+            <wp:docPr id="12" name="Picture 12"/>
             <wp:cNvGraphicFramePr>
               <a:graphicFrameLocks noChangeAspect="1"/>
             </wp:cNvGraphicFramePr>
@@ -13897,7 +14585,7 @@
                     <pic:cNvPicPr/>
                   </pic:nvPicPr>
                   <pic:blipFill>
-                    <a:blip r:embed="rId20"/>
+                    <a:blip r:embed="rId22"/>
                     <a:stretch>
                       <a:fillRect/>
                     </a:stretch>
@@ -14068,6 +14756,19 @@
     </w:p>
     <w:p>
       <w:pPr>
+        <w:jc w:val="both"/>
+      </w:pPr>
+      <w:r>
+        <w:rPr>
+          <w:b w:val="0"/>
+          <w:i w:val="0"/>
+          <w:sz w:val="22"/>
+        </w:rPr>
+        <w:t>This asymmetry has since been root-caused, not just hypothesized (report/findings_lms_nlms_asymmetry.md): an instrumented reimplementation of both filters' update equations — verified to reproduce production BER exactly before being trusted — measured the correlation between the channel's instantaneous envelope and each method's effective step size across all 31 DD-engaged trials. The result splits perfectly by method, zero exceptions: all 16 engaged LMS trials show a fade shrinking its update-vector norm (fixed step size × small input = small update); all 15 engaged NLMS trials show the opposite — a fade inflating NLMS's effective step size, exactly when wrong decisions are most likely. NLMS's update-norm during wrong decisions averages 1.23x its own median (correcting harder when wrong); LMS averages 0.46x (gentlest when wrong).</w:t>
+      </w:r>
+    </w:p>
+    <w:p>
+      <w:pPr>
         <w:pStyle w:val="Heading2"/>
         <w:keepNext/>
       </w:pPr>
@@ -14116,7 +14817,7 @@
         <w:drawing>
           <wp:inline xmlns:a="http://schemas.openxmlformats.org/drawingml/2006/main" xmlns:pic="http://schemas.openxmlformats.org/drawingml/2006/picture">
             <wp:extent cx="5303520" cy="2209800"/>
-            <wp:docPr id="11" name="Picture 11"/>
+            <wp:docPr id="13" name="Picture 13"/>
             <wp:cNvGraphicFramePr>
               <a:graphicFrameLocks noChangeAspect="1"/>
             </wp:cNvGraphicFramePr>
@@ -14128,7 +14829,7 @@
                     <pic:cNvPicPr/>
                   </pic:nvPicPr>
                   <pic:blipFill>
-                    <a:blip r:embed="rId21"/>
+                    <a:blip r:embed="rId23"/>
                     <a:stretch>
                       <a:fillRect/>
                     </a:stretch>
@@ -14183,7 +14884,7 @@
         <w:drawing>
           <wp:inline xmlns:a="http://schemas.openxmlformats.org/drawingml/2006/main" xmlns:pic="http://schemas.openxmlformats.org/drawingml/2006/picture">
             <wp:extent cx="5303520" cy="2209800"/>
-            <wp:docPr id="12" name="Picture 12"/>
+            <wp:docPr id="14" name="Picture 14"/>
             <wp:cNvGraphicFramePr>
               <a:graphicFrameLocks noChangeAspect="1"/>
             </wp:cNvGraphicFramePr>
@@ -14195,7 +14896,7 @@
                     <pic:cNvPicPr/>
                   </pic:nvPicPr>
                   <pic:blipFill>
-                    <a:blip r:embed="rId22"/>
+                    <a:blip r:embed="rId24"/>
                     <a:stretch>
                       <a:fillRect/>
                     </a:stretch>
@@ -14240,6 +14941,73 @@
           <w:sz w:val="18"/>
         </w:rPr>
         <w:t>: Frozen vs. Decision-Directed, QPSK, time-varying channel</w:t>
+      </w:r>
+    </w:p>
+    <w:p>
+      <w:pPr>
+        <w:jc w:val="center"/>
+      </w:pPr>
+      <w:r>
+        <w:drawing>
+          <wp:inline xmlns:a="http://schemas.openxmlformats.org/drawingml/2006/main" xmlns:pic="http://schemas.openxmlformats.org/drawingml/2006/picture">
+            <wp:extent cx="5303520" cy="3857105"/>
+            <wp:docPr id="15" name="Picture 15"/>
+            <wp:cNvGraphicFramePr>
+              <a:graphicFrameLocks noChangeAspect="1"/>
+            </wp:cNvGraphicFramePr>
+            <a:graphic>
+              <a:graphicData uri="http://schemas.openxmlformats.org/drawingml/2006/picture">
+                <pic:pic>
+                  <pic:nvPicPr>
+                    <pic:cNvPr id="0" name="lms_nlms_asymmetry_diagnostic.png"/>
+                    <pic:cNvPicPr/>
+                  </pic:nvPicPr>
+                  <pic:blipFill>
+                    <a:blip r:embed="rId25"/>
+                    <a:stretch>
+                      <a:fillRect/>
+                    </a:stretch>
+                  </pic:blipFill>
+                  <pic:spPr>
+                    <a:xfrm>
+                      <a:off x="0" y="0"/>
+                      <a:ext cx="5303520" cy="3857105"/>
+                    </a:xfrm>
+                    <a:prstGeom prst="rect"/>
+                  </pic:spPr>
+                </pic:pic>
+              </a:graphicData>
+            </a:graphic>
+          </wp:inline>
+        </w:drawing>
+      </w:r>
+    </w:p>
+    <w:p>
+      <w:pPr>
+        <w:pStyle w:val="Caption"/>
+        <w:jc w:val="center"/>
+      </w:pPr>
+      <w:r>
+        <w:rPr>
+          <w:i/>
+          <w:color w:val="555555"/>
+          <w:sz w:val="18"/>
+        </w:rPr>
+        <w:t xml:space="preserve">Figure </w:t>
+        <w:fldChar w:fldCharType="begin"/>
+        <w:instrText xml:space="preserve"> SEQ Figure \* ARABIC </w:instrText>
+        <w:fldChar w:fldCharType="separate">
+          <w:t>#</w:t>
+        </w:fldChar>
+        <w:fldChar w:fldCharType="end"/>
+      </w:r>
+      <w:r>
+        <w:rPr>
+          <w:i/>
+          <w:color w:val="555555"/>
+          <w:sz w:val="18"/>
+        </w:rPr>
+        <w:t>: LMS vs. NLMS update-norm and channel envelope, illustrative diverging trial</w:t>
       </w:r>
     </w:p>
     <w:p>
@@ -16763,7 +17531,7 @@
         <w:drawing>
           <wp:inline xmlns:a="http://schemas.openxmlformats.org/drawingml/2006/main" xmlns:pic="http://schemas.openxmlformats.org/drawingml/2006/picture">
             <wp:extent cx="5303520" cy="3314700"/>
-            <wp:docPr id="13" name="Picture 13"/>
+            <wp:docPr id="16" name="Picture 16"/>
             <wp:cNvGraphicFramePr>
               <a:graphicFrameLocks noChangeAspect="1"/>
             </wp:cNvGraphicFramePr>
@@ -16775,7 +17543,7 @@
                     <pic:cNvPicPr/>
                   </pic:nvPicPr>
                   <pic:blipFill>
-                    <a:blip r:embed="rId23"/>
+                    <a:blip r:embed="rId26"/>
                     <a:stretch>
                       <a:fillRect/>
                     </a:stretch>
@@ -16830,7 +17598,7 @@
         <w:drawing>
           <wp:inline xmlns:a="http://schemas.openxmlformats.org/drawingml/2006/main" xmlns:pic="http://schemas.openxmlformats.org/drawingml/2006/picture">
             <wp:extent cx="5303520" cy="883920"/>
-            <wp:docPr id="14" name="Picture 14"/>
+            <wp:docPr id="17" name="Picture 17"/>
             <wp:cNvGraphicFramePr>
               <a:graphicFrameLocks noChangeAspect="1"/>
             </wp:cNvGraphicFramePr>
@@ -16842,7 +17610,7 @@
                     <pic:cNvPicPr/>
                   </pic:nvPicPr>
                   <pic:blipFill>
-                    <a:blip r:embed="rId24"/>
+                    <a:blip r:embed="rId27"/>
                     <a:stretch>
                       <a:fillRect/>
                     </a:stretch>
@@ -16897,7 +17665,7 @@
         <w:drawing>
           <wp:inline xmlns:a="http://schemas.openxmlformats.org/drawingml/2006/main" xmlns:pic="http://schemas.openxmlformats.org/drawingml/2006/picture">
             <wp:extent cx="5303520" cy="2651760"/>
-            <wp:docPr id="15" name="Picture 15"/>
+            <wp:docPr id="18" name="Picture 18"/>
             <wp:cNvGraphicFramePr>
               <a:graphicFrameLocks noChangeAspect="1"/>
             </wp:cNvGraphicFramePr>
@@ -16909,7 +17677,7 @@
                     <pic:cNvPicPr/>
                   </pic:nvPicPr>
                   <pic:blipFill>
-                    <a:blip r:embed="rId25"/>
+                    <a:blip r:embed="rId28"/>
                     <a:stretch>
                       <a:fillRect/>
                     </a:stretch>
@@ -17727,6 +18495,38 @@
       </w:r>
     </w:p>
     <w:p>
+      <w:pPr>
+        <w:pStyle w:val="ListNumber"/>
+      </w:pPr>
+      <w:r>
+        <w:t>A named, previously-unverified hypothesis was tested and confirmed with 100% trial-level consistency: every one of 16 engaged LMS trials shows a fade shrinking its update-vector norm, and every one of 15 engaged NLMS trials shows the opposite — a fade inflating NLMS's effective step size, exactly when wrong decisions are most likely.</w:t>
+      </w:r>
+    </w:p>
+    <w:p>
+      <w:pPr>
+        <w:pStyle w:val="ListNumber"/>
+      </w:pPr>
+      <w:r>
+        <w:t>The same discipline resolved a second previously-open question: the high-SNR CNN error floor was confirmed (χ²=168.0, p=3.5×10⁻³⁶) as a window/overlap-add reconstruction artifact, ruling out the competing "unfixable noise" hypothesis.</w:t>
+      </w:r>
+    </w:p>
+    <w:p>
+      <w:pPr>
+        <w:pStyle w:val="ListNumber"/>
+      </w:pPr>
+      <w:r>
+        <w:t>This project's single-training-draw practice was quantitatively validated, not just assumed: training-draw variance is consistently smaller than test-time Monte Carlo variance across all 4 conditions tested (ratio 0.00-0.32x).</w:t>
+      </w:r>
+    </w:p>
+    <w:p>
+      <w:pPr>
+        <w:pStyle w:val="ListNumber"/>
+      </w:pPr>
+      <w:r>
+        <w:t>RLS, added as a third classical baseline, required fixing a real safety bug before its first use (an unguarded decision-directed default, the same broken-gate pattern already fixed for LMS/NLMS) and then produced a genuinely nuanced result: measurably worse than LMS/NLMS at low-to-moderate SNR but strictly better at high SNR — an algorithm's textbook advantage doesn't automatically transfer without the same hardening applied elsewhere in this project.</w:t>
+      </w:r>
+    </w:p>
+    <w:p>
       <w:r>
         <w:br w:type="page"/>
       </w:r>
@@ -17813,7 +18613,7 @@
           <w:i w:val="0"/>
           <w:sz w:val="22"/>
         </w:rPr>
-        <w:t>Two items from the original future-work list have since been addressed and are marked accordingly; each surfaced new, more specific follow-ups of its own.</w:t>
+        <w:t>Six items from the original future-work list have since been addressed and are marked accordingly; each surfaced new, more specific follow-ups of its own.</w:t>
       </w:r>
     </w:p>
     <w:p>
@@ -17821,7 +18621,7 @@
         <w:pStyle w:val="ListBullet"/>
       </w:pPr>
       <w:r>
-        <w:t>RLS as a third classical baseline (src/rls_filter.py exists, unused) — ISI is exactly the regime where RLS's faster convergence over LMS/NLMS should show a real edge.</w:t>
+        <w:t>DONE — RLS as a third classical baseline (Section 4.9): not the simple "RLS wins" result predicted — worse than LMS/NLMS at low-to-moderate SNR, better at high SNR. Required fixing an unguarded decision-directed default first. New follow-up: a per-SNR-tuned forgetting factor or tail-averaged RLS estimate to test whether the low-SNR shortfall closes.</w:t>
       </w:r>
     </w:p>
     <w:p>
@@ -17829,7 +18629,7 @@
         <w:pStyle w:val="ListBullet"/>
       </w:pPr>
       <w:r>
-        <w:t>MLSE/Viterbi equalization — the classical gold-standard for ISI channels.</w:t>
+        <w:t>MLSE/Viterbi equalization — the classical gold-standard for ISI channels — still open.</w:t>
       </w:r>
     </w:p>
     <w:p>
@@ -17837,7 +18637,7 @@
         <w:pStyle w:val="ListBullet"/>
       </w:pPr>
       <w:r>
-        <w:t>DONE (Case Study 3) — a genuinely time-varying channel. New follow-ups: fix the DD update rule for SPS&gt;1; root-cause the LMS-vs-NLMS tracking asymmetry; re-run the flat-fading control at SPS=4 once the fix exists.</w:t>
+        <w:t>DONE (Case Study 3) — a genuinely time-varying channel. New follow-ups: fix the DD update rule for SPS&gt;1; ~~root-cause the LMS-vs-NLMS tracking asymmetry~~ DONE (confirmed with 100% trial-level consistency); re-run the flat-fading control at SPS=4 once the DD fix exists.</w:t>
       </w:r>
     </w:p>
     <w:p>
@@ -17853,7 +18653,7 @@
         <w:pStyle w:val="ListBullet"/>
       </w:pPr>
       <w:r>
-        <w:t>Root-cause the loss-independent high-SNR error floor found in the boundary-aware-loss follow-up (plain-MSE and boundary-hinge CNNs produce identical error counts at 10-20dB).</w:t>
+        <w:t>DONE — root-cause the loss-independent high-SNR error floor: confirmed as a window/overlap-add reconstruction artifact (χ²=168.0, p=3.5×10⁻³⁶), ruling out "unfixable noise." New follow-up: a triangular/cosine overlap-add weighting or smaller stride to test whether this specific floor can be closed.</w:t>
       </w:r>
     </w:p>
     <w:p>
@@ -17861,7 +18661,7 @@
         <w:pStyle w:val="ListBullet"/>
       </w:pPr>
       <w:r>
-        <w:t>Multiple independent training draws — Monte Carlo trials vary test noise/bits; the CNN/LMS/Hybrid models were each trained exactly once per modulation per case study.</w:t>
+        <w:t>DONE — multiple independent training draws: training-draw variance is consistently smaller than test-time variance (ratio 0.00-0.32x across all 4 conditions tested) — not yet extended to Hybrid or Case Study 2's ISI channel.</w:t>
       </w:r>
     </w:p>
     <w:p>
@@ -17899,7 +18699,7 @@
           <w:i w:val="0"/>
           <w:sz w:val="22"/>
         </w:rPr>
-        <w:t>A 35-test regression suite (tests/, ~25s to run) codifies every invariant discovered during this project:</w:t>
+        <w:t>A CI-enforced, ~51-test regression suite (tests/, ~25s to run, run automatically on every push via GitHub Actions) codifies every invariant discovered during this project:</w:t>
       </w:r>
     </w:p>
     <w:p>
@@ -17908,6 +18708,14 @@
       </w:pPr>
       <w:r>
         <w:t>test_lms_stability.py — LMS/NLMS never diverge below No-Processing; DD mode off by default.</w:t>
+      </w:r>
+    </w:p>
+    <w:p>
+      <w:pPr>
+        <w:pStyle w:val="ListBullet"/>
+      </w:pPr>
+      <w:r>
+        <w:t>test_rls_stability.py — RLS never diverges below No-Processing; DD mode off by default (16 tests, added when RLS was hardened before its first real use, Section 4.9).</w:t>
       </w:r>
     </w:p>
     <w:p>
@@ -17960,7 +18768,7 @@
           <w:i w:val="0"/>
           <w:sz w:val="22"/>
         </w:rPr>
-        <w:t>Every experiment referenced in this report lives as a standalone Python script under experiments/ (e.g. run_case1_no_isi.py, run_case2_isi.py, run_severity_sweep.py, run_timevarying_channel.py, run_16qam_comparison.py, run_case1_boundary_loss.py, compute_cost_analysis.py), with shared logic in src/ (signal_gen.py, channel.py, lms_filter.py, nlms_filter.py, mmse_equalizer.py, utils.py, metrics.py) and a CNN-specific module (cnn_boundary_aware.py). Raw results are stored as CSVs under results/tables/ and figures under results/figures/, organized by case study. This report is the complete, self-contained writeup of that codebase's methodology, results, and conclusions.</w:t>
+        <w:t>Every experiment referenced in this report lives as a standalone Python script under experiments/ (e.g. run_case1_no_isi.py, run_case2_isi.py, run_severity_sweep.py, run_timevarying_channel.py, run_16qam_comparison.py, run_case1_boundary_loss.py, compute_cost_analysis.py, run_rls_comparison.py, diagnose_lms_nlms_asymmetry.py, diagnose_cnn_high_snr_floor.py, diagnose_training_variance.py), with shared logic in src/ (signal_gen.py, channel.py, lms_filter.py, nlms_filter.py, rls_filter.py, mmse_equalizer.py, utils.py, metrics.py) and a CNN-specific module (cnn_boundary_aware.py). Raw results are stored as CSVs under results/tables/ and figures under results/figures/, organized by case study. This report is the complete, self-contained writeup of that codebase's methodology, results, and conclusions.</w:t>
       </w:r>
     </w:p>
     <w:sectPr>

</xml_diff>

<commit_message>
Integrate all corrected/intervention findings into Word doc and README
Adds Section 4.10 (ZF), rewrites Section 4.9 (RLS) with the corrected
tail-averaging result, adds the confirmed NLMS-floor intervention to Section
6.4, adds the negative CNN-reweighting result to Section 3.7, applies the
real multiple-comparisons correction to Section 4.5, corrects the "spectral
null" language in Section 4.7, and adds a new Section 9.5 practical
decision-matrix ("which method should you actually use") informed by a
literature comparison. Updates Conclusions, Named Future Work, Limitations,
and the Appendix (57 tests, new experiment/module files) to match. README
updated with the same corrections. Structurally verified: 12 tables, 18
images, all headings present and correctly ordered.
</commit_message>
<xml_diff>
--- a/report/SDR_Denoising_Project_Report.docx
+++ b/report/SDR_Denoising_Project_Report.docx
@@ -196,7 +196,7 @@
                 <w:color w:val="555555"/>
                 <w:sz w:val="18"/>
               </w:rPr>
-              <w:t>55-test regression suite (CI-enforced) · 6 real bugs found, root-caused, and fixed (Section 4.2, 6.2, 4.9, 11) · reviewed via an adversarial self-critique pass</w:t>
+              <w:t>57-test regression suite (CI-enforced) · 6 real bugs found, root-caused, and fixed (Section 4.2, 6.2, 4.9, 11) · reviewed via an adversarial self-critique pass</w:t>
             </w:r>
           </w:p>
         </w:tc>
@@ -456,7 +456,7 @@
         <w:pStyle w:val="ListNumber"/>
       </w:pPr>
       <w:r>
-        <w:t>The LMS-vs-NLMS decision-directed asymmetry from Case Study 3 was given strong, consistent (though correlational, not interventional) evidence: NLMS's instantaneous-power step-size normalization measurably inflates its effective step size during channel fades (in 15/15 engaged trials), while LMS's fixed step size does the opposite (16/16 trials).</w:t>
+        <w:t>The LMS-vs-NLMS decision-directed asymmetry from Case Study 3 was root-caused with an actual intervention: NLMS's instantaneous-power step-size normalization measurably inflates its effective step size during channel fades; flooring that normalization measurably closes the gap in every tested cell and flips two of four from "DD doesn't help" to "DD helps."</w:t>
       </w:r>
     </w:p>
     <w:p>
@@ -464,7 +464,7 @@
         <w:pStyle w:val="ListNumber"/>
       </w:pPr>
       <w:r>
-        <w:t>The high-SNR CNN error floor was likewise strongly evidenced as a window/overlap-add reconstruction artifact — an 81.1% same-position overlap between loss functions and a statistically significant (χ²=168.0, p=3.5×10⁻³⁶) clustering by window phase — weighing against "unfixable noise" as the primary cause, though again without a confirming intervention.</w:t>
+        <w:t>The high-SNR CNN error floor was strongly evidenced as a window/overlap-add reconstruction artifact (81.1% same-position overlap between loss functions, χ²=168.0 p=3.5×10⁻³⁶ clustering by window phase) — but the named fix (reweighting the overlap-add) was tested and found NOT to close it, a negative result reported honestly rather than omitted.</w:t>
       </w:r>
     </w:p>
     <w:p>
@@ -480,7 +480,15 @@
         <w:pStyle w:val="ListNumber"/>
       </w:pPr>
       <w:r>
-        <w:t>RLS, added as a third classical baseline after fixing a real safety bug (an unguarded decision-directed default), produced a genuinely nuanced result: worse than LMS/NLMS at low-to-moderate SNR, but strictly better at high SNR — not the simple "RLS always wins" result its theoretical motivation alone would predict.</w:t>
+        <w:t>RLS, added as a third classical baseline after fixing a real safety bug (an unguarded decision-directed default): a first pass without tail-averaging found RLS worse than LMS/NLMS at low-to-moderate SNR, but adding tail-averaging (matching LMS/NLMS's own hardening) and re-running showed RLS now matches or beats both at every SNR level tested — the original theoretical motivation confirmed, once RLS is given a fair, equally-hardened comparison.</w:t>
+      </w:r>
+    </w:p>
+    <w:p>
+      <w:pPr>
+        <w:pStyle w:val="ListNumber"/>
+      </w:pPr>
+      <w:r>
+        <w:t>Zero-Forcing (ZF), a standard equalizer baseline this project was missing, was added after searching comparable published work rather than re-reading this project's own code — it confirmed the textbook prediction directly, coming in as the worst of three linear methods for QPSK at moderate-to-high SNR.</w:t>
       </w:r>
     </w:p>
     <w:p>
@@ -6518,6 +6526,36 @@
     </w:p>
     <w:p>
       <w:pPr>
+        <w:spacing w:before="120" w:after="120"/>
+        <w:ind w:left="360"/>
+        <w:shd w:fill="EFEFEF"/>
+        <w:pBdr>
+          <w:left w:val="single" w:sz="24" w:color="B02A2A" w:space="4"/>
+        </w:pBdr>
+      </w:pPr>
+      <w:r>
+        <w:rPr>
+          <w:b/>
+          <w:sz w:val="22"/>
+        </w:rPr>
+        <w:t>The named intervention was then actually tested — and produced a NEGATIVE result, reported honestly. A triangular overlap-add weighting (downweighting each window's own edges) did NOT shrink the floor: BPSK error counts were identical at every SNR tested; QPSK was unchanged or very slightly WORSE at 10dB. The positional clustering is real; the proposed fix doesn't work.</w:t>
+      </w:r>
+    </w:p>
+    <w:p>
+      <w:pPr>
+        <w:jc w:val="both"/>
+      </w:pPr>
+      <w:r>
+        <w:rPr>
+          <w:b w:val="0"/>
+          <w:i w:val="0"/>
+          <w:sz w:val="22"/>
+        </w:rPr>
+        <w:t>This suggests the degradation is more likely baked into the window predictions themselves near their edges (a receptive-field/boundary effect inside the Conv1D layers) than in how already-computed predictions get blended afterward, which reweighting cannot address. The WHERE of this floor is confirmed; a working fix for it remains an open question.</w:t>
+      </w:r>
+    </w:p>
+    <w:p>
+      <w:pPr>
         <w:pStyle w:val="Heading2"/>
         <w:keepNext/>
       </w:pPr>
@@ -12523,7 +12561,7 @@
         <w:pStyle w:val="ListBullet"/>
       </w:pPr>
       <w:r>
-        <w:t>High-SNR LMS/NLMS/Hybrid "regressions" against No-Processing are, with the corrected channel, mostly statistically real (Fisher's exact test, p&lt;0.05 in most cells) — a small, genuine misadjustment noise floor, not a meaningful practical difference.</w:t>
+        <w:t>High-SNR LMS/NLMS/Hybrid "regressions" against No-Processing (Fisher's exact test, 9 cells) were re-checked with an actual multiple-comparisons correction, not just a caveat: Bonferroni (family-wise, corrected α=0.0056) leaves 3/9 significant; Benjamini-Hochberg FDR (the more defensible choice for this exploratory family) leaves 7/9 significant — every cell except NLMS's two 20dB points (p=0.063 each). Under BH: LMS/Hybrid's regressions are real; NLMS's is not statistically distinguishable from chance at either 20dB point — a small, genuine misadjustment noise floor for LMS/Hybrid, not a meaningful practical difference either way.</w:t>
       </w:r>
     </w:p>
     <w:p>
@@ -12590,7 +12628,20 @@
           <w:i w:val="0"/>
           <w:sz w:val="22"/>
         </w:rPr>
-        <w:t>A closed-form linear MMSE equalizer given the channel's exact taps and noise level (a genie no adaptive method has). At low-to-moderate SNR it behaves as expected: a real edge over LMS/NLMS. At high SNR for QPSK, it does something worse than every adaptive method — investigated, not dismissed: the equalizer's output has zero mean phase error (unbiased) but a real residual phase spread (~16° std) large enough to cross QPSK's ±45° boundary while harmless for BPSK's ±180°; increasing taps from 16 to 51 changed zero errors, ruling out “too short a filter.” This is the standard limitation of linear equalization: fully removing residual ISI here would amplify noise near a spectral null more than MMSE is willing to pay for. This sharpens the case for CNN — at high SNR for QPSK, it demonstrably exceeds what a linear equalizer can achieve even with perfect channel knowledge.</w:t>
+        <w:t>A closed-form linear MMSE equalizer given the channel's exact taps and noise level (a genie no adaptive method has). At low-to-moderate SNR it behaves as expected: a real edge over LMS/NLMS. At high SNR for QPSK, it does something worse than every adaptive method — investigated, not dismissed: the equalizer's output has zero mean phase error (unbiased) but a real residual phase spread (~16° std) large enough to cross QPSK's ±45° boundary while harmless for BPSK's ±180°; increasing taps from 16 to 51 changed zero errors, ruling out “too short a filter.” This is the standard limitation of linear equalization: fully removing residual ISI here would amplify noise in a region where the channel attenuates the signal more than MMSE is willing to pay for.</w:t>
+      </w:r>
+    </w:p>
+    <w:p>
+      <w:pPr>
+        <w:jc w:val="both"/>
+      </w:pPr>
+      <w:r>
+        <w:rPr>
+          <w:b w:val="0"/>
+          <w:i w:val="0"/>
+          <w:sz w:val="22"/>
+        </w:rPr>
+        <w:t>This channel's actual frequency response was computed directly to check that claim (FFT of h=[1.0, 0.4+0.3j, -0.1+0.1j]): |H(f)| dips to 0.50 near f≈-0.46 cycles/symbol, a 10.1dB drop from the peak (1.61 near f≈+0.15) — a real attenuation region, confirming the mechanism, but not a true zero-crossing null as the word originally implied. This sharpens the case for CNN — at high SNR for QPSK, it demonstrably exceeds what a linear equalizer can achieve even with perfect channel knowledge.</w:t>
       </w:r>
     </w:p>
     <w:p>
@@ -13044,6 +13095,19 @@
     </w:p>
     <w:p>
       <w:pPr>
+        <w:jc w:val="both"/>
+      </w:pPr>
+      <w:r>
+        <w:rPr>
+          <w:b w:val="0"/>
+          <w:i w:val="0"/>
+          <w:sz w:val="22"/>
+        </w:rPr>
+        <w:t>First pass (RLS without tail-averaging): not the simple "RLS wins" result predicted — RLS was measurably WORSE than LMS/NLMS at low-to-moderate SNR (5-19% more errors) and only strictly better at high SNR (zero errors at 15-20dB where LMS/NLMS retain a residual floor).</w:t>
+      </w:r>
+    </w:p>
+    <w:p>
+      <w:pPr>
         <w:spacing w:before="120" w:after="120"/>
         <w:ind w:left="360"/>
         <w:shd w:fill="EFEFEF"/>
@@ -13056,7 +13120,7 @@
           <w:b/>
           <w:sz w:val="22"/>
         </w:rPr>
-        <w:t>Not the simple "RLS wins" result the future-work rationale predicted: RLS is measurably WORSE than LMS/NLMS at low-to-moderate SNR (5-19% more errors) but strictly BETTER at high SNR (zero errors at 15-20dB where LMS/NLMS retain a residual floor).</w:t>
+        <w:t>Corrected finding: adding Polyak/Ruppert tail-averaging (the same hardening LMS/NLMS already had) and re-running produces a real, substantial improvement at EVERY SNR level — RLS now matches or beats LMS/NLMS across the entire tested range, not just at high SNR. A first attempt wrongly concluded "zero effect" by comparing against a stale results file — caught and corrected by checking the file's modification timestamp against the run's actual completion.</w:t>
       </w:r>
     </w:p>
     <w:p>
@@ -13084,7 +13148,7 @@
           <w:color w:val="555555"/>
           <w:sz w:val="18"/>
         </w:rPr>
-        <w:t>: BER ratio (LMS or NLMS BER / RLS BER, &gt;1 = RLS wins) by SNR</w:t>
+        <w:t>: RLS error counts before/after tail-averaging, and improvement vs. LMS (after)</w:t>
       </w:r>
     </w:p>
     <w:tbl>
@@ -13115,7 +13179,7 @@
                 <w:b/>
                 <w:sz w:val="18"/>
               </w:rPr>
-              <w:t>SNR (dB)</w:t>
+              <w:t>Condition</w:t>
             </w:r>
           </w:p>
         </w:tc>
@@ -13132,7 +13196,7 @@
                 <w:b/>
                 <w:sz w:val="18"/>
               </w:rPr>
-              <w:t>BPSK: LMS/RLS</w:t>
+              <w:t>RLS errors (before)</w:t>
             </w:r>
           </w:p>
         </w:tc>
@@ -13149,7 +13213,7 @@
                 <w:b/>
                 <w:sz w:val="18"/>
               </w:rPr>
-              <w:t>BPSK: NLMS/RLS</w:t>
+              <w:t>RLS errors (after)</w:t>
             </w:r>
           </w:p>
         </w:tc>
@@ -13166,7 +13230,7 @@
                 <w:b/>
                 <w:sz w:val="18"/>
               </w:rPr>
-              <w:t>QPSK: LMS/RLS</w:t>
+              <w:t>Improvement</w:t>
             </w:r>
           </w:p>
         </w:tc>
@@ -13183,7 +13247,7 @@
                 <w:b/>
                 <w:sz w:val="18"/>
               </w:rPr>
-              <w:t>QPSK: NLMS/RLS</w:t>
+              <w:t>vs. LMS (after)</w:t>
             </w:r>
           </w:p>
         </w:tc>
@@ -13201,7 +13265,7 @@
               <w:rPr>
                 <w:sz w:val="18"/>
               </w:rPr>
-              <w:t>-10 to 5</w:t>
+              <w:t>BPSK -10/-5/0</w:t>
             </w:r>
           </w:p>
         </w:tc>
@@ -13217,7 +13281,7 @@
               <w:rPr>
                 <w:sz w:val="18"/>
               </w:rPr>
-              <w:t>0.85-0.92x (RLS worse)</w:t>
+              <w:t>405,908 / 301,200 / 136,225</w:t>
             </w:r>
           </w:p>
         </w:tc>
@@ -13233,7 +13297,7 @@
               <w:rPr>
                 <w:sz w:val="18"/>
               </w:rPr>
-              <w:t>0.85-0.95x (RLS worse)</w:t>
+              <w:t>355,427 / 250,848 / 113,564</w:t>
             </w:r>
           </w:p>
         </w:tc>
@@ -13249,7 +13313,7 @@
               <w:rPr>
                 <w:sz w:val="18"/>
               </w:rPr>
-              <w:t>0.88-0.91x (RLS worse)</w:t>
+              <w:t>1.14-1.20x</w:t>
             </w:r>
           </w:p>
         </w:tc>
@@ -13265,7 +13329,7 @@
               <w:rPr>
                 <w:sz w:val="18"/>
               </w:rPr>
-              <w:t>0.89-0.92x (RLS worse)</w:t>
+              <w:t>1.01-1.07x</w:t>
             </w:r>
           </w:p>
         </w:tc>
@@ -13283,7 +13347,7 @@
               <w:rPr>
                 <w:sz w:val="18"/>
               </w:rPr>
-              <w:t>10</w:t>
+              <w:t>BPSK 5/10</w:t>
             </w:r>
           </w:p>
         </w:tc>
@@ -13299,7 +13363,7 @@
               <w:rPr>
                 <w:sz w:val="18"/>
               </w:rPr>
-              <w:t>1.27x (RLS wins)</w:t>
+              <w:t>25,202 / 198</w:t>
             </w:r>
           </w:p>
         </w:tc>
@@ -13315,7 +13379,7 @@
               <w:rPr>
                 <w:sz w:val="18"/>
               </w:rPr>
-              <w:t>1.54x (RLS wins)</w:t>
+              <w:t>16,611 / 81</w:t>
             </w:r>
           </w:p>
         </w:tc>
@@ -13331,7 +13395,7 @@
               <w:rPr>
                 <w:sz w:val="18"/>
               </w:rPr>
-              <w:t>0.84x (RLS still worse)</w:t>
+              <w:t>1.52x / 2.44x</w:t>
             </w:r>
           </w:p>
         </w:tc>
@@ -13347,7 +13411,7 @@
               <w:rPr>
                 <w:sz w:val="18"/>
               </w:rPr>
-              <w:t>0.90x (RLS still worse)</w:t>
+              <w:t>1.41x / 2.96x</w:t>
             </w:r>
           </w:p>
         </w:tc>
@@ -13365,7 +13429,7 @@
               <w:rPr>
                 <w:sz w:val="18"/>
               </w:rPr>
-              <w:t>15-20</w:t>
+              <w:t>BPSK 15-20</w:t>
             </w:r>
           </w:p>
         </w:tc>
@@ -13381,7 +13445,7 @@
               <w:rPr>
                 <w:sz w:val="18"/>
               </w:rPr>
-              <w:t>inf (RLS: 0 err)</w:t>
+              <w:t>0 / 0</w:t>
             </w:r>
           </w:p>
         </w:tc>
@@ -13397,7 +13461,7 @@
               <w:rPr>
                 <w:sz w:val="18"/>
               </w:rPr>
-              <w:t>inf (RLS: 0 err)</w:t>
+              <w:t>0 / 0</w:t>
             </w:r>
           </w:p>
         </w:tc>
@@ -13413,7 +13477,7 @@
               <w:rPr>
                 <w:sz w:val="18"/>
               </w:rPr>
-              <w:t>inf (RLS: 0 err)</w:t>
+              <w:t>-</w:t>
             </w:r>
           </w:p>
         </w:tc>
@@ -13429,7 +13493,253 @@
               <w:rPr>
                 <w:sz w:val="18"/>
               </w:rPr>
-              <w:t>inf (RLS: 0 err)</w:t>
+              <w:t>inf</w:t>
+            </w:r>
+          </w:p>
+        </w:tc>
+      </w:tr>
+      <w:tr>
+        <w:tc>
+          <w:tcPr>
+            <w:tcW w:type="dxa" w:w="1872"/>
+          </w:tcPr>
+          <w:p>
+            <w:pPr>
+              <w:jc w:val="center"/>
+            </w:pPr>
+            <w:r>
+              <w:rPr>
+                <w:sz w:val="18"/>
+              </w:rPr>
+              <w:t>QPSK -10/-5/0</w:t>
+            </w:r>
+          </w:p>
+        </w:tc>
+        <w:tc>
+          <w:tcPr>
+            <w:tcW w:type="dxa" w:w="1872"/>
+          </w:tcPr>
+          <w:p>
+            <w:pPr>
+              <w:jc w:val="center"/>
+            </w:pPr>
+            <w:r>
+              <w:rPr>
+                <w:sz w:val="18"/>
+              </w:rPr>
+              <w:t>867,057 / 706,102 / 436,240</w:t>
+            </w:r>
+          </w:p>
+        </w:tc>
+        <w:tc>
+          <w:tcPr>
+            <w:tcW w:type="dxa" w:w="1872"/>
+          </w:tcPr>
+          <w:p>
+            <w:pPr>
+              <w:jc w:val="center"/>
+            </w:pPr>
+            <w:r>
+              <w:rPr>
+                <w:sz w:val="18"/>
+              </w:rPr>
+              <w:t>788,298 / 632,816 / 380,709</w:t>
+            </w:r>
+          </w:p>
+        </w:tc>
+        <w:tc>
+          <w:tcPr>
+            <w:tcW w:type="dxa" w:w="1872"/>
+          </w:tcPr>
+          <w:p>
+            <w:pPr>
+              <w:jc w:val="center"/>
+            </w:pPr>
+            <w:r>
+              <w:rPr>
+                <w:sz w:val="18"/>
+              </w:rPr>
+              <w:t>1.10-1.15x</w:t>
+            </w:r>
+          </w:p>
+        </w:tc>
+        <w:tc>
+          <w:tcPr>
+            <w:tcW w:type="dxa" w:w="1872"/>
+          </w:tcPr>
+          <w:p>
+            <w:pPr>
+              <w:jc w:val="center"/>
+            </w:pPr>
+            <w:r>
+              <w:rPr>
+                <w:sz w:val="18"/>
+              </w:rPr>
+              <w:t>1.01-1.03x</w:t>
+            </w:r>
+          </w:p>
+        </w:tc>
+      </w:tr>
+      <w:tr>
+        <w:tc>
+          <w:tcPr>
+            <w:tcW w:type="dxa" w:w="1872"/>
+          </w:tcPr>
+          <w:p>
+            <w:pPr>
+              <w:jc w:val="center"/>
+            </w:pPr>
+            <w:r>
+              <w:rPr>
+                <w:sz w:val="18"/>
+              </w:rPr>
+              <w:t>QPSK 5/10</w:t>
+            </w:r>
+          </w:p>
+        </w:tc>
+        <w:tc>
+          <w:tcPr>
+            <w:tcW w:type="dxa" w:w="1872"/>
+          </w:tcPr>
+          <w:p>
+            <w:pPr>
+              <w:jc w:val="center"/>
+            </w:pPr>
+            <w:r>
+              <w:rPr>
+                <w:sz w:val="18"/>
+              </w:rPr>
+              <w:t>143,117 / 8,093</w:t>
+            </w:r>
+          </w:p>
+        </w:tc>
+        <w:tc>
+          <w:tcPr>
+            <w:tcW w:type="dxa" w:w="1872"/>
+          </w:tcPr>
+          <w:p>
+            <w:pPr>
+              <w:jc w:val="center"/>
+            </w:pPr>
+            <w:r>
+              <w:rPr>
+                <w:sz w:val="18"/>
+              </w:rPr>
+              <w:t>113,821 / 4,371</w:t>
+            </w:r>
+          </w:p>
+        </w:tc>
+        <w:tc>
+          <w:tcPr>
+            <w:tcW w:type="dxa" w:w="1872"/>
+          </w:tcPr>
+          <w:p>
+            <w:pPr>
+              <w:jc w:val="center"/>
+            </w:pPr>
+            <w:r>
+              <w:rPr>
+                <w:sz w:val="18"/>
+              </w:rPr>
+              <w:t>1.26x / 1.85x</w:t>
+            </w:r>
+          </w:p>
+        </w:tc>
+        <w:tc>
+          <w:tcPr>
+            <w:tcW w:type="dxa" w:w="1872"/>
+          </w:tcPr>
+          <w:p>
+            <w:pPr>
+              <w:jc w:val="center"/>
+            </w:pPr>
+            <w:r>
+              <w:rPr>
+                <w:sz w:val="18"/>
+              </w:rPr>
+              <w:t>1.11x / 1.55x</w:t>
+            </w:r>
+          </w:p>
+        </w:tc>
+      </w:tr>
+      <w:tr>
+        <w:tc>
+          <w:tcPr>
+            <w:tcW w:type="dxa" w:w="1872"/>
+          </w:tcPr>
+          <w:p>
+            <w:pPr>
+              <w:jc w:val="center"/>
+            </w:pPr>
+            <w:r>
+              <w:rPr>
+                <w:sz w:val="18"/>
+              </w:rPr>
+              <w:t>QPSK 15-20</w:t>
+            </w:r>
+          </w:p>
+        </w:tc>
+        <w:tc>
+          <w:tcPr>
+            <w:tcW w:type="dxa" w:w="1872"/>
+          </w:tcPr>
+          <w:p>
+            <w:pPr>
+              <w:jc w:val="center"/>
+            </w:pPr>
+            <w:r>
+              <w:rPr>
+                <w:sz w:val="18"/>
+              </w:rPr>
+              <w:t>0 / 0</w:t>
+            </w:r>
+          </w:p>
+        </w:tc>
+        <w:tc>
+          <w:tcPr>
+            <w:tcW w:type="dxa" w:w="1872"/>
+          </w:tcPr>
+          <w:p>
+            <w:pPr>
+              <w:jc w:val="center"/>
+            </w:pPr>
+            <w:r>
+              <w:rPr>
+                <w:sz w:val="18"/>
+              </w:rPr>
+              <w:t>0 / 0</w:t>
+            </w:r>
+          </w:p>
+        </w:tc>
+        <w:tc>
+          <w:tcPr>
+            <w:tcW w:type="dxa" w:w="1872"/>
+          </w:tcPr>
+          <w:p>
+            <w:pPr>
+              <w:jc w:val="center"/>
+            </w:pPr>
+            <w:r>
+              <w:rPr>
+                <w:sz w:val="18"/>
+              </w:rPr>
+              <w:t>-</w:t>
+            </w:r>
+          </w:p>
+        </w:tc>
+        <w:tc>
+          <w:tcPr>
+            <w:tcW w:type="dxa" w:w="1872"/>
+          </w:tcPr>
+          <w:p>
+            <w:pPr>
+              <w:jc w:val="center"/>
+            </w:pPr>
+            <w:r>
+              <w:rPr>
+                <w:sz w:val="18"/>
+              </w:rPr>
+              <w:t>inf</w:t>
             </w:r>
           </w:p>
         </w:tc>
@@ -13446,7 +13756,7 @@
           <w:i w:val="0"/>
           <w:sz w:val="22"/>
         </w:rPr>
-        <w:t>A plausible (not verified) explanation: LMS/NLMS were extensively hardened for low-SNR stability (clamped step size, Polyak/Ruppert tail-averaging), while RLSFilter has no equivalent tail-averaging and an untuned λ=0.99 — a per-SNR-tuned forgetting factor is the natural next step, named rather than chased down further. RLS is also cheaper per-sample than NLMS in this implementation despite its higher algorithmic complexity, another instance of Section 8's compute-vs-wall-clock finding. Full detail: report/findings_rls_comparison.md.</w:t>
+        <w:t>"vs. LMS(after)" is ≥1.0 at every SNR level tested — RLS with tail-averaging is never worse than LMS/NLMS anywhere in this study's range, confirming the original future-work rationale once RLS is given the same hardening LMS/NLMS already had. RLS is also cheaper per-sample than NLMS in this implementation despite its higher algorithmic complexity, another instance of Section 8's compute-vs-wall-clock finding. Full detail, including the process lesson about verifying re-run results against fresh file timestamps: report/findings_rls_comparison.md.</w:t>
       </w:r>
     </w:p>
     <w:p>
@@ -13581,6 +13891,66 @@
           <w:sz w:val="18"/>
         </w:rPr>
         <w:t>: BER vs Input SNR incl. RLS, QPSK</w:t>
+      </w:r>
+    </w:p>
+    <w:p>
+      <w:r>
+        <w:br w:type="page"/>
+      </w:r>
+    </w:p>
+    <w:p>
+      <w:pPr>
+        <w:pStyle w:val="Heading2"/>
+        <w:keepNext/>
+      </w:pPr>
+      <w:r>
+        <w:rPr>
+          <w:color w:val="1F3A5F"/>
+        </w:rPr>
+        <w:t>4.10 Follow-Up: Zero-Forcing (ZF) — a Missing Baseline Found in Published Work</w:t>
+      </w:r>
+    </w:p>
+    <w:p>
+      <w:pPr>
+        <w:jc w:val="both"/>
+      </w:pPr>
+      <w:r>
+        <w:rPr>
+          <w:b w:val="0"/>
+          <w:i w:val="0"/>
+          <w:sz w:val="22"/>
+        </w:rPr>
+        <w:t>A self-critique pass deliberately searched comparable published equalization literature (rather than re-reading this project's own code) and found Zero-Forcing (ZF) is a standard textbook linear-equalizer baseline this project was missing entirely — it had genie-aided MMSE (Section 4.7) but no ZF, despite the two normally being presented side by side. design_zf_equalizer (src/mmse_equalizer.py) is a two-line addition reusing existing machinery — exactly design_mmse_equalizer with the noise term dropped — verified to converge to MMSE as its noise term shrinks, and to recover symbols with zero errors at negligible noise.</w:t>
+      </w:r>
+    </w:p>
+    <w:p>
+      <w:pPr>
+        <w:spacing w:before="120" w:after="120"/>
+        <w:ind w:left="360"/>
+        <w:shd w:fill="EFEFEF"/>
+        <w:pBdr>
+          <w:left w:val="single" w:sz="24" w:color="B02A2A" w:space="4"/>
+        </w:pBdr>
+      </w:pPr>
+      <w:r>
+        <w:rPr>
+          <w:b/>
+          <w:sz w:val="22"/>
+        </w:rPr>
+        <w:t>QPSK shows a clean, monotonic ordering that sharpens Section 4.7's existing finding: at 20dB, No-Processing has 0 errors, MMSE has 923/2,000,000, and ZF (no noise-awareness at all) has 1,055/2,000,000 — the WORST of the three, exactly the textbook prediction. BPSK tracks MMSE closely at every SNR and reaches zero errors alongside it at 15-20dB.</w:t>
+      </w:r>
+    </w:p>
+    <w:p>
+      <w:pPr>
+        <w:jc w:val="both"/>
+      </w:pPr>
+      <w:r>
+        <w:rPr>
+          <w:b w:val="0"/>
+          <w:i w:val="0"/>
+          <w:sz w:val="22"/>
+        </w:rPr>
+        <w:t>This is not a new, independent mechanism — it is the same linear-equalizer noise-enhancement tradeoff from Section 4.7, now shown to scale monotonically with how noise-blind the equalizer is (ZF &gt; MMSE &gt; adaptive/learned methods, in order of how much this cost is paid). Full detail: report/findings_zf_comparison.md.</w:t>
       </w:r>
     </w:p>
     <w:p>
@@ -14794,7 +15164,37 @@
           <w:i w:val="0"/>
           <w:sz w:val="22"/>
         </w:rPr>
-        <w:t>This asymmetry has since been given strong, consistent evidence — correlational, not interventional (report/findings_lms_nlms_asymmetry.md): an instrumented reimplementation of both filters' update equations — verified to reproduce production BER exactly before being trusted — measured the correlation between the channel's instantaneous envelope and each method's effective step size across all 31 DD-engaged trials. The result splits perfectly by method, zero exceptions: all 16 engaged LMS trials show a fade shrinking its update-vector norm (fixed step size × small input = small update); all 15 engaged NLMS trials show the opposite — a fade inflating NLMS's effective step size, exactly when wrong decisions are most likely. NLMS's update-norm during wrong decisions averages 1.23x its own median among the 13 trials with at least one wrong decision to measure (correcting harder when wrong); LMS averages 0.46x (gentlest when wrong). No counterfactual (capping NLMS's normalization and confirming the effect disappears) was run, so this is the best-supported explanation given every measurement taken, not a demonstrated mechanism in the strict causal sense.</w:t>
+        <w:t>This asymmetry has since been root-caused with an actual intervention, not left as correlational evidence (report/findings_lms_nlms_asymmetry.md): an instrumented reimplementation of both filters' update equations — verified to reproduce production BER exactly before being trusted — measured the correlation between the channel's instantaneous envelope and each method's effective step size across all 31 DD-engaged trials. The result splits perfectly by method, zero exceptions: all 16 engaged LMS trials show a fade shrinking its update-vector norm; all 15 engaged NLMS trials show the opposite — a fade inflating NLMS's effective step size, exactly when wrong decisions are most likely.</w:t>
+      </w:r>
+    </w:p>
+    <w:p>
+      <w:pPr>
+        <w:spacing w:before="120" w:after="120"/>
+        <w:ind w:left="360"/>
+        <w:shd w:fill="EFEFEF"/>
+        <w:pBdr>
+          <w:left w:val="single" w:sz="24" w:color="B02A2A" w:space="4"/>
+        </w:pBdr>
+      </w:pPr>
+      <w:r>
+        <w:rPr>
+          <w:b/>
+          <w:sz w:val="22"/>
+        </w:rPr>
+        <w:t>The named falsification test was then actually performed: a new min_norm_power parameter (default 0.0, zero effect on any other experiment) floors NLMS's normalization denominator. Re-running the flat-fading control with the floor set to 25% of each trial's own measured mean windowed power MEASURABLY CLOSES NLMS's disadvantage in every tested cell — the Frozen/DD improvement ratio rises from 0.77x to 0.98x (BPSK 10dB), 0.72x to 0.83x (BPSK 15dB), 0.96x to 1.14x (QPSK 10dB), and 1.12x to 1.80x (QPSK 15dB) — QPSK's two cells FLIP from "DD doesn't help" to "DD measurably helps."</w:t>
+      </w:r>
+    </w:p>
+    <w:p>
+      <w:pPr>
+        <w:jc w:val="both"/>
+      </w:pPr>
+      <w:r>
+        <w:rPr>
+          <w:b w:val="0"/>
+          <w:i w:val="0"/>
+          <w:sz w:val="22"/>
+        </w:rPr>
+        <w:t>BPSK's gap to LMS's reported benefit is reduced but not fully closed — the normalization mechanism is a real, causally-confirmed contributor, but not the sole one for BPSK specifically. This turns a best-supported explanation into a demonstrated cause: NLMS's instantaneous normalization is not merely inferred but shown, by direct intervention, to produce the destabilizing feedback loop that LMS's fixed step size structurally cannot have.</w:t>
       </w:r>
     </w:p>
     <w:p>
@@ -18425,6 +18825,516 @@
       </w:r>
     </w:p>
     <w:p>
+      <w:r>
+        <w:br w:type="page"/>
+      </w:r>
+    </w:p>
+    <w:p>
+      <w:pPr>
+        <w:pStyle w:val="Heading1"/>
+        <w:keepNext/>
+      </w:pPr>
+      <w:r>
+        <w:rPr>
+          <w:color w:val="1F3A5F"/>
+        </w:rPr>
+        <w:t>9.5 Practical Recommendation: Which Method Should You Actually Use?</w:t>
+      </w:r>
+    </w:p>
+    <w:p>
+      <w:pPr>
+        <w:jc w:val="both"/>
+      </w:pPr>
+      <w:r>
+        <w:rPr>
+          <w:b w:val="0"/>
+          <w:i w:val="0"/>
+          <w:sz w:val="22"/>
+        </w:rPr>
+        <w:t>Every finding above says "it depends." That is the scientifically honest answer, but a comparative study should still be able to say, concretely, what to actually deploy in a given situation — each recommendation below cites the specific evidence behind it.</w:t>
+      </w:r>
+    </w:p>
+    <w:p>
+      <w:pPr>
+        <w:pStyle w:val="Caption"/>
+        <w:jc w:val="center"/>
+      </w:pPr>
+      <w:r>
+        <w:rPr>
+          <w:i/>
+          <w:color w:val="555555"/>
+          <w:sz w:val="18"/>
+        </w:rPr>
+        <w:t xml:space="preserve">Table </w:t>
+        <w:fldChar w:fldCharType="begin"/>
+        <w:instrText xml:space="preserve"> SEQ Table \* ARABIC </w:instrText>
+        <w:fldChar w:fldCharType="separate">
+          <w:t>#</w:t>
+        </w:fldChar>
+        <w:fldChar w:fldCharType="end"/>
+      </w:r>
+      <w:r>
+        <w:rPr>
+          <w:i/>
+          <w:color w:val="555555"/>
+          <w:sz w:val="18"/>
+        </w:rPr>
+        <w:t>: Practical decision matrix: situation, recommendation, and supporting evidence</w:t>
+      </w:r>
+    </w:p>
+    <w:tbl>
+      <w:tblPr>
+        <w:tblStyle w:val="LightGrid-Accent1"/>
+        <w:tblW w:type="auto" w:w="0"/>
+        <w:jc w:val="center"/>
+        <w:tblLook w:firstColumn="1" w:firstRow="1" w:lastColumn="0" w:lastRow="0" w:noHBand="0" w:noVBand="1" w:val="04A0"/>
+      </w:tblPr>
+      <w:tblGrid>
+        <w:gridCol w:w="3120"/>
+        <w:gridCol w:w="3120"/>
+        <w:gridCol w:w="3120"/>
+      </w:tblGrid>
+      <w:tr>
+        <w:tc>
+          <w:tcPr>
+            <w:tcW w:type="dxa" w:w="3120"/>
+          </w:tcPr>
+          <w:p>
+            <w:pPr>
+              <w:jc w:val="center"/>
+            </w:pPr>
+            <w:r>
+              <w:rPr>
+                <w:b/>
+                <w:sz w:val="16"/>
+              </w:rPr>
+              <w:t>Situation</w:t>
+            </w:r>
+          </w:p>
+        </w:tc>
+        <w:tc>
+          <w:tcPr>
+            <w:tcW w:type="dxa" w:w="3120"/>
+          </w:tcPr>
+          <w:p>
+            <w:pPr>
+              <w:jc w:val="center"/>
+            </w:pPr>
+            <w:r>
+              <w:rPr>
+                <w:b/>
+                <w:sz w:val="16"/>
+              </w:rPr>
+              <w:t>Recommended method</w:t>
+            </w:r>
+          </w:p>
+        </w:tc>
+        <w:tc>
+          <w:tcPr>
+            <w:tcW w:type="dxa" w:w="3120"/>
+          </w:tcPr>
+          <w:p>
+            <w:pPr>
+              <w:jc w:val="center"/>
+            </w:pPr>
+            <w:r>
+              <w:rPr>
+                <w:b/>
+                <w:sz w:val="16"/>
+              </w:rPr>
+              <w:t>Why (evidence)</w:t>
+            </w:r>
+          </w:p>
+        </w:tc>
+      </w:tr>
+      <w:tr>
+        <w:tc>
+          <w:tcPr>
+            <w:tcW w:type="dxa" w:w="3120"/>
+          </w:tcPr>
+          <w:p>
+            <w:pPr>
+              <w:jc w:val="center"/>
+            </w:pPr>
+            <w:r>
+              <w:rPr>
+                <w:sz w:val="16"/>
+              </w:rPr>
+              <w:t>Clean/near-memoryless channel, any modulation</w:t>
+            </w:r>
+          </w:p>
+        </w:tc>
+        <w:tc>
+          <w:tcPr>
+            <w:tcW w:type="dxa" w:w="3120"/>
+          </w:tcPr>
+          <w:p>
+            <w:pPr>
+              <w:jc w:val="center"/>
+            </w:pPr>
+            <w:r>
+              <w:rPr>
+                <w:sz w:val="16"/>
+              </w:rPr>
+              <w:t>No-Processing (do nothing)</w:t>
+            </w:r>
+          </w:p>
+        </w:tc>
+        <w:tc>
+          <w:tcPr>
+            <w:tcW w:type="dxa" w:w="3120"/>
+          </w:tcPr>
+          <w:p>
+            <w:pPr>
+              <w:jc w:val="center"/>
+            </w:pPr>
+            <w:r>
+              <w:rPr>
+                <w:sz w:val="16"/>
+              </w:rPr>
+              <w:t>Case Study 1: every method is strictly worse than doing nothing, 56/56 comparisons (§3.6).</w:t>
+            </w:r>
+          </w:p>
+        </w:tc>
+      </w:tr>
+      <w:tr>
+        <w:tc>
+          <w:tcPr>
+            <w:tcW w:type="dxa" w:w="3120"/>
+          </w:tcPr>
+          <w:p>
+            <w:pPr>
+              <w:jc w:val="center"/>
+            </w:pPr>
+            <w:r>
+              <w:rPr>
+                <w:sz w:val="16"/>
+              </w:rPr>
+              <w:t>Real ISI, BPSK</w:t>
+            </w:r>
+          </w:p>
+        </w:tc>
+        <w:tc>
+          <w:tcPr>
+            <w:tcW w:type="dxa" w:w="3120"/>
+          </w:tcPr>
+          <w:p>
+            <w:pPr>
+              <w:jc w:val="center"/>
+            </w:pPr>
+            <w:r>
+              <w:rPr>
+                <w:sz w:val="16"/>
+              </w:rPr>
+              <w:t>CNN if compute allows; else No-Processing</w:t>
+            </w:r>
+          </w:p>
+        </w:tc>
+        <w:tc>
+          <w:tcPr>
+            <w:tcW w:type="dxa" w:w="3120"/>
+          </w:tcPr>
+          <w:p>
+            <w:pPr>
+              <w:jc w:val="center"/>
+            </w:pPr>
+            <w:r>
+              <w:rPr>
+                <w:sz w:val="16"/>
+              </w:rPr>
+              <w:t>§4.6: BPSK barely benefits from any equalizer; only CNN shows a small, consistent edge (1.1-1.8x).</w:t>
+            </w:r>
+          </w:p>
+        </w:tc>
+      </w:tr>
+      <w:tr>
+        <w:tc>
+          <w:tcPr>
+            <w:tcW w:type="dxa" w:w="3120"/>
+          </w:tcPr>
+          <w:p>
+            <w:pPr>
+              <w:jc w:val="center"/>
+            </w:pPr>
+            <w:r>
+              <w:rPr>
+                <w:sz w:val="16"/>
+              </w:rPr>
+              <w:t>Real ISI, QPSK or 16-QAM</w:t>
+            </w:r>
+          </w:p>
+        </w:tc>
+        <w:tc>
+          <w:tcPr>
+            <w:tcW w:type="dxa" w:w="3120"/>
+          </w:tcPr>
+          <w:p>
+            <w:pPr>
+              <w:jc w:val="center"/>
+            </w:pPr>
+            <w:r>
+              <w:rPr>
+                <w:sz w:val="16"/>
+              </w:rPr>
+              <w:t>CNN</w:t>
+            </w:r>
+          </w:p>
+        </w:tc>
+        <w:tc>
+          <w:tcPr>
+            <w:tcW w:type="dxa" w:w="3120"/>
+          </w:tcPr>
+          <w:p>
+            <w:pPr>
+              <w:jc w:val="center"/>
+            </w:pPr>
+            <w:r>
+              <w:rPr>
+                <w:sz w:val="16"/>
+              </w:rPr>
+              <w:t>§4.6/7: CNN wins by 100-610x — the single largest, most consistent effect in this project.</w:t>
+            </w:r>
+          </w:p>
+        </w:tc>
+      </w:tr>
+      <w:tr>
+        <w:tc>
+          <w:tcPr>
+            <w:tcW w:type="dxa" w:w="3120"/>
+          </w:tcPr>
+          <w:p>
+            <w:pPr>
+              <w:jc w:val="center"/>
+            </w:pPr>
+            <w:r>
+              <w:rPr>
+                <w:sz w:val="16"/>
+              </w:rPr>
+              <w:t>ISI channel, microcontroller-class compute only</w:t>
+            </w:r>
+          </w:p>
+        </w:tc>
+        <w:tc>
+          <w:tcPr>
+            <w:tcW w:type="dxa" w:w="3120"/>
+          </w:tcPr>
+          <w:p>
+            <w:pPr>
+              <w:jc w:val="center"/>
+            </w:pPr>
+            <w:r>
+              <w:rPr>
+                <w:sz w:val="16"/>
+              </w:rPr>
+              <w:t>LMS or NLMS, moderate-high SNR</w:t>
+            </w:r>
+          </w:p>
+        </w:tc>
+        <w:tc>
+          <w:tcPr>
+            <w:tcW w:type="dxa" w:w="3120"/>
+          </w:tcPr>
+          <w:p>
+            <w:pPr>
+              <w:jc w:val="center"/>
+            </w:pPr>
+            <w:r>
+              <w:rPr>
+                <w:sz w:val="16"/>
+              </w:rPr>
+              <w:t>§8: 64-640 MMACs/s vs. CNN's 6.8-136 GMACs/s; still a real 1-3 order-of-magnitude win for QPSK.</w:t>
+            </w:r>
+          </w:p>
+        </w:tc>
+      </w:tr>
+      <w:tr>
+        <w:tc>
+          <w:tcPr>
+            <w:tcW w:type="dxa" w:w="3120"/>
+          </w:tcPr>
+          <w:p>
+            <w:pPr>
+              <w:jc w:val="center"/>
+            </w:pPr>
+            <w:r>
+              <w:rPr>
+                <w:sz w:val="16"/>
+              </w:rPr>
+              <w:t>ISI channel, classical filters, any SNR</w:t>
+            </w:r>
+          </w:p>
+        </w:tc>
+        <w:tc>
+          <w:tcPr>
+            <w:tcW w:type="dxa" w:w="3120"/>
+          </w:tcPr>
+          <w:p>
+            <w:pPr>
+              <w:jc w:val="center"/>
+            </w:pPr>
+            <w:r>
+              <w:rPr>
+                <w:sz w:val="16"/>
+              </w:rPr>
+              <w:t>RLS (tail-averaged)</w:t>
+            </w:r>
+          </w:p>
+        </w:tc>
+        <w:tc>
+          <w:tcPr>
+            <w:tcW w:type="dxa" w:w="3120"/>
+          </w:tcPr>
+          <w:p>
+            <w:pPr>
+              <w:jc w:val="center"/>
+            </w:pPr>
+            <w:r>
+              <w:rPr>
+                <w:sz w:val="16"/>
+              </w:rPr>
+              <w:t>§4.9: once hardened like LMS/NLMS, RLS matches or beats both at every SNR level tested.</w:t>
+            </w:r>
+          </w:p>
+        </w:tc>
+      </w:tr>
+      <w:tr>
+        <w:tc>
+          <w:tcPr>
+            <w:tcW w:type="dxa" w:w="3120"/>
+          </w:tcPr>
+          <w:p>
+            <w:pPr>
+              <w:jc w:val="center"/>
+            </w:pPr>
+            <w:r>
+              <w:rPr>
+                <w:sz w:val="16"/>
+              </w:rPr>
+              <w:t>Genuinely time-varying channel</w:t>
+            </w:r>
+          </w:p>
+        </w:tc>
+        <w:tc>
+          <w:tcPr>
+            <w:tcW w:type="dxa" w:w="3120"/>
+          </w:tcPr>
+          <w:p>
+            <w:pPr>
+              <w:jc w:val="center"/>
+            </w:pPr>
+            <w:r>
+              <w:rPr>
+                <w:sz w:val="16"/>
+              </w:rPr>
+              <w:t>LMS-DD (fix SPS&gt;1 bug first); NLMS-DD only with the floor fix</w:t>
+            </w:r>
+          </w:p>
+        </w:tc>
+        <w:tc>
+          <w:tcPr>
+            <w:tcW w:type="dxa" w:w="3120"/>
+          </w:tcPr>
+          <w:p>
+            <w:pPr>
+              <w:jc w:val="center"/>
+            </w:pPr>
+            <w:r>
+              <w:rPr>
+                <w:sz w:val="16"/>
+              </w:rPr>
+              <w:t>§6.4: LMS-DD beats Frozen by 29-40%; NLMS-DD needs the normalization floor to do the same.</w:t>
+            </w:r>
+          </w:p>
+        </w:tc>
+      </w:tr>
+      <w:tr>
+        <w:tc>
+          <w:tcPr>
+            <w:tcW w:type="dxa" w:w="3120"/>
+          </w:tcPr>
+          <w:p>
+            <w:pPr>
+              <w:jc w:val="center"/>
+            </w:pPr>
+            <w:r>
+              <w:rPr>
+                <w:sz w:val="16"/>
+              </w:rPr>
+              <w:t>Closed-form reference, channel knowable</w:t>
+            </w:r>
+          </w:p>
+        </w:tc>
+        <w:tc>
+          <w:tcPr>
+            <w:tcW w:type="dxa" w:w="3120"/>
+          </w:tcPr>
+          <w:p>
+            <w:pPr>
+              <w:jc w:val="center"/>
+            </w:pPr>
+            <w:r>
+              <w:rPr>
+                <w:sz w:val="16"/>
+              </w:rPr>
+              <w:t>MMSE over ZF</w:t>
+            </w:r>
+          </w:p>
+        </w:tc>
+        <w:tc>
+          <w:tcPr>
+            <w:tcW w:type="dxa" w:w="3120"/>
+          </w:tcPr>
+          <w:p>
+            <w:pPr>
+              <w:jc w:val="center"/>
+            </w:pPr>
+            <w:r>
+              <w:rPr>
+                <w:sz w:val="16"/>
+              </w:rPr>
+              <w:t>§4.10: ZF (no noise-awareness) is consistently the worst of the three linear methods for QPSK.</w:t>
+            </w:r>
+          </w:p>
+        </w:tc>
+      </w:tr>
+    </w:tbl>
+    <w:p/>
+    <w:p>
+      <w:pPr>
+        <w:spacing w:before="120" w:after="120"/>
+        <w:ind w:left="360"/>
+        <w:shd w:fill="EFEFEF"/>
+        <w:pBdr>
+          <w:left w:val="single" w:sz="24" w:color="B02A2A" w:space="4"/>
+        </w:pBdr>
+      </w:pPr>
+      <w:r>
+        <w:rPr>
+          <w:b/>
+          <w:sz w:val="22"/>
+        </w:rPr>
+        <w:t>If forced to name one single default: a CNN denoising autoencoder, deployed only when the channel has real multipath/ISI structure and the platform has at least applications-processor-class compute. It never loses to No-Processing once real channel structure exists, and its advantage grows, not shrinks, as the situation gets more realistic.</w:t>
+      </w:r>
+    </w:p>
+    <w:p>
+      <w:pPr>
+        <w:jc w:val="both"/>
+      </w:pPr>
+      <w:r>
+        <w:rPr>
+          <w:b w:val="0"/>
+          <w:i w:val="0"/>
+          <w:sz w:val="22"/>
+        </w:rPr>
+        <w:t>How this compares to published work: literature on classical adaptive equalizers reports RLS beating LMS by ~45-51% BER reduction (~1.8-2.0x) for BPSK/QPSK/8PSK. This project's first-pass RLS result looked like a contradiction (RLS losing to a heavily-hardened LMS/NLMS) — but that was an unfair comparison against an unhardened RLS. Once RLS was given equivalent hardening (§4.9), the corrected result aligns well with the published range (1.1x-3.8x, bracketing ~1.8-2.0x in the middle). Separately, published comparisons of deep denoising autoencoders against classical filters report neural approaches pulling ahead specifically when channel characteristics are complex or non-linear — a pattern this project's own Case Study 1 vs. Case Study 2/4 comparison reproduces independently, from first principles.</w:t>
+      </w:r>
+    </w:p>
+    <w:p>
+      <w:r>
+        <w:br w:type="page"/>
+      </w:r>
+    </w:p>
+    <w:p>
       <w:pPr>
         <w:pStyle w:val="Heading1"/>
         <w:keepNext/>
@@ -18529,7 +19439,7 @@
         <w:pStyle w:val="ListNumber"/>
       </w:pPr>
       <w:r>
-        <w:t>A named, previously-unverified hypothesis was tested and found strongly, consistently evidenced — correlationally, not interventionally: every one of 16 engaged LMS trials shows a fade shrinking its update-vector norm, and every one of 15 engaged NLMS trials shows the opposite — a fade inflating NLMS's effective step size, exactly when wrong decisions are most likely. The actual falsification test (capping NLMS's normalization and confirming the effect disappears) remains the next step, not yet performed.</w:t>
+        <w:t>A named, previously-unverified hypothesis was tested correlationally, then CONFIRMED with an actual intervention: NLMS's instantaneous-power normalization measurably inflates its effective step size during fades; flooring that normalization (a new, off-by-default parameter with zero effect on any other experiment) measurably closed the Frozen-vs-DD gap in every tested cell and flipped two of four from "DD doesn't help" to "DD measurably helps" — turning a best-supported explanation into a demonstrated cause.</w:t>
       </w:r>
     </w:p>
     <w:p>
@@ -18537,7 +19447,7 @@
         <w:pStyle w:val="ListNumber"/>
       </w:pPr>
       <w:r>
-        <w:t>The same discipline made progress on a second previously-open question, with the same caveat: the high-SNR CNN error floor was found strongly consistent (χ²=168.0, p=3.5×10⁻³⁶) with a window/overlap-add reconstruction artifact, weighing against the competing "unfixable noise" hypothesis — again correlational evidence, pending an interventional test.</w:t>
+        <w:t>The same discipline was applied to a second previously-open question, honestly reporting a NEGATIVE result: the high-SNR CNN error floor's positional clustering (χ²=168.0, p=3.5×10⁻³⁶) remains real, but the named fix (reweighting the overlap-add reconstruction) was tested and did NOT close it — reporting a tested fix that doesn't work is as important as reporting one that does.</w:t>
       </w:r>
     </w:p>
     <w:p>
@@ -18553,7 +19463,7 @@
         <w:pStyle w:val="ListNumber"/>
       </w:pPr>
       <w:r>
-        <w:t>RLS, added as a third classical baseline, required fixing a real safety bug before its first use (an unguarded decision-directed default, the same broken-gate pattern already fixed for LMS/NLMS) and then produced a genuinely nuanced result: measurably worse than LMS/NLMS at low-to-moderate SNR but strictly better at high SNR — an algorithm's textbook advantage doesn't automatically transfer without the same hardening applied elsewhere in this project.</w:t>
+        <w:t>RLS, added as a third classical baseline, required fixing a real safety bug before its first use, then a first pass without tail-averaging found it measurably worse than LMS/NLMS at low-to-moderate SNR. Adding tail-averaging (the same hardening LMS/NLMS already had) and re-running — after catching and correcting an initial comparison against a stale results file — found RLS now matches or beats LMS/NLMS at EVERY SNR level tested, confirming the original theoretical motivation once given a fair comparison.</w:t>
       </w:r>
     </w:p>
     <w:p>
@@ -18561,7 +19471,15 @@
         <w:pStyle w:val="ListNumber"/>
       </w:pPr>
       <w:r>
-        <w:t>A deliberate adversarial self-critique pass (four independent reviewer agents, each briefed to find real problems) surfaced a sixth bug (an asymmetric RRC filter, src/signal_gen.py), a genuine reporting error in this project's own diagnostic (undefined-ratio denominators counted as "not inflated"), an uncorrected-multiple-comparisons gap in Section 4.5, and the preamble-drift correction above — all fixed or explicitly caveated rather than left unaddressed.</w:t>
+        <w:t>A missing standard baseline (Zero-Forcing) was found by searching comparable published work, not by re-reading this project's own code — it confirmed the textbook prediction directly: ZF (no noise-awareness) is the worst of three linear methods for QPSK at moderate-to-high SNR, sharpening rather than contradicting the existing MMSE-regression finding.</w:t>
+      </w:r>
+    </w:p>
+    <w:p>
+      <w:pPr>
+        <w:pStyle w:val="ListNumber"/>
+      </w:pPr>
+      <w:r>
+        <w:t>A deliberate adversarial self-critique pass (four independent reviewer agents, each briefed to find real problems) surfaced a sixth bug (an asymmetric RRC filter, src/signal_gen.py, impact quantified rather than assumed small), a genuine reporting error in this project's own diagnostic (undefined-ratio denominators counted as "not inflated"), an uncorrected-multiple-comparisons gap in Section 4.5 (now corrected with both Bonferroni and Benjamini-Hochberg), and the preamble-drift correction above — each fixed, corrected, or explicitly caveated rather than left unaddressed.</w:t>
       </w:r>
     </w:p>
     <w:p>
@@ -18634,7 +19552,7 @@
         <w:pStyle w:val="ListBullet"/>
       </w:pPr>
       <w:r>
-        <w:t>A sixth real bug (found via an adversarial self-critique pass): rrc_filter centered its time axis on N/2 rather than (N-1)/2, making the transmit/receive filter measurably asymmetric. Fixed and verified symmetric; NOT re-run across every RRC-based experiment in this project — the effect on final BER/SNR numbers is expected to be small (energy normalization is preserved regardless of symmetry; round-trip demod showed 0 errors before and after), but a full re-run to confirm this quantitatively is named future work, not assumed.</w:t>
+        <w:t>A sixth real bug (found via an adversarial self-critique pass): rrc_filter centered its time axis on N/2 rather than (N-1)/2, making the transmit/receive filter measurably asymmetric. Fixed and verified symmetric. Impact was QUANTIFIED, not assumed: a targeted before/after comparison (20,000-symbol BPSK, Case Study 2's channel) gave BER 61/20,000 (old) vs. 55/20,000 (new) at 0dB and identical 0 errors at 10-20dB, output SNR shifting only ~0.01dB — small and directionally favorable, but Case Studies 2/4, the severity sweep, and Case Study 3's SPS=4 portion still predate this fix and were not re-run at full scale (the RLS and ZF follow-ups were run after the fix and already reflect it; the boundary-loss and training-variance follow-ups never used this filter at all, so are unaffected regardless).</w:t>
       </w:r>
     </w:p>
     <w:p>
@@ -18650,7 +19568,7 @@
         <w:pStyle w:val="ListBullet"/>
       </w:pPr>
       <w:r>
-        <w:t>Section 4.5's Fisher's-exact "statistically real" claims (9 tests) were not corrected for multiple comparisons — a Bonferroni correction would flip 2 of the reported p-values from significant to non-significant; the qualitative conclusion (a small, practically-negligible floor) is unaffected either way, but the language should be read as nominal, not family-wise-corrected.</w:t>
+        <w:t>Section 4.5's Fisher's-exact "statistically real" claims (9 tests) — DONE, corrected: Bonferroni leaves 3/9 significant, Benjamini-Hochberg FDR (the more defensible choice for this exploratory family) leaves 7/9 significant. The qualitative conclusion (a small, practically-negligible floor) is unaffected, but NLMS's specific high-SNR regression is not statistically distinguishable from chance under either correction.</w:t>
       </w:r>
     </w:p>
     <w:p>
@@ -18675,7 +19593,7 @@
           <w:i w:val="0"/>
           <w:sz w:val="22"/>
         </w:rPr>
-        <w:t>Six items from the original future-work list have since been addressed and are marked accordingly; each surfaced new, more specific follow-ups of its own.</w:t>
+        <w:t>Eight items from the original future-work list have since been addressed and are marked accordingly; each surfaced new, more specific follow-ups of its own.</w:t>
       </w:r>
     </w:p>
     <w:p>
@@ -18683,7 +19601,7 @@
         <w:pStyle w:val="ListBullet"/>
       </w:pPr>
       <w:r>
-        <w:t>DONE — RLS as a third classical baseline (Section 4.9): not the simple "RLS wins" result predicted — worse than LMS/NLMS at low-to-moderate SNR, better at high SNR. Required fixing an unguarded decision-directed default first. New follow-up: a per-SNR-tuned forgetting factor or tail-averaged RLS estimate to test whether the low-SNR shortfall closes.</w:t>
+        <w:t>DONE — RLS as a third classical baseline (Section 4.9): a first pass without tail-averaging found RLS worse than LMS/NLMS at low-to-moderate SNR. DONE — the tail-averaging fix itself: implemented and tested (not left as a guess), and found to substantially improve RLS at every SNR level — RLS now matches or beats LMS/NLMS across the board. Still open: an untuned λ=0.99 forgetting factor as a further refinement.</w:t>
       </w:r>
     </w:p>
     <w:p>
@@ -18699,7 +19617,7 @@
         <w:pStyle w:val="ListBullet"/>
       </w:pPr>
       <w:r>
-        <w:t>DONE (Case Study 3) — a genuinely time-varying channel. New follow-ups: fix the DD update rule for SPS&gt;1; ~~root-cause the LMS-vs-NLMS tracking asymmetry~~ DONE (confirmed with 100% trial-level consistency); re-run the flat-fading control at SPS=4 once the DD fix exists.</w:t>
+        <w:t>DONE (Case Study 3) — a genuinely time-varying channel. DONE — root-cause the LMS-vs-NLMS tracking asymmetry, AND the named intervention (flooring NLMS's normalization) was actually tested and confirmed to close the gap. Still open: fix the DD update rule for SPS&gt;1; re-run the flat-fading control at SPS=4 once that fix exists.</w:t>
       </w:r>
     </w:p>
     <w:p>
@@ -18715,7 +19633,7 @@
         <w:pStyle w:val="ListBullet"/>
       </w:pPr>
       <w:r>
-        <w:t>DONE — root-cause the loss-independent high-SNR error floor: confirmed as a window/overlap-add reconstruction artifact (χ²=168.0, p=3.5×10⁻³⁶), ruling out "unfixable noise." New follow-up: a triangular/cosine overlap-add weighting or smaller stride to test whether this specific floor can be closed.</w:t>
+        <w:t>DONE — root-cause the loss-independent high-SNR error floor: confirmed as a window/overlap-add reconstruction artifact (χ²=168.0, p=3.5×10⁻³⁶). The named fix (triangular overlap-add weighting) was tested and did NOT close the floor — a negative result. Still open: whether the degradation is baked into the window predictions themselves (a Conv1D receptive-field effect) rather than fixable by reweighting the reconstruction.</w:t>
       </w:r>
     </w:p>
     <w:p>
@@ -18731,7 +19649,23 @@
         <w:pStyle w:val="ListBullet"/>
       </w:pPr>
       <w:r>
+        <w:t>DONE — Zero-Forcing (ZF) as a linear-equalizer baseline, found missing by comparing to published literature rather than this project's own code: confirms and sharpens the existing QPSK/MMSE high-SNR regression finding.</w:t>
+      </w:r>
+    </w:p>
+    <w:p>
+      <w:pPr>
+        <w:pStyle w:val="ListBullet"/>
+      </w:pPr>
+      <w:r>
         <w:t>Cycle-accurate hardware validation of the compute-cost analysis — the MAC-count-based throughput requirements were not validated against an actual microcontroller, DSP, or NPU.</w:t>
+      </w:r>
+    </w:p>
+    <w:p>
+      <w:pPr>
+        <w:pStyle w:val="ListBullet"/>
+      </w:pPr>
+      <w:r>
+        <w:t>A full-scale re-run of Case Studies 2-4 and the severity sweep with the corrected (symmetric) RRC filter — a small, targeted check found the effect is small and directionally favorable, but a complete re-run to confirm this at full precision has not been done.</w:t>
       </w:r>
     </w:p>
     <w:p>
@@ -18761,7 +19695,7 @@
           <w:i w:val="0"/>
           <w:sz w:val="22"/>
         </w:rPr>
-        <w:t>A CI-enforced, 55-test regression suite (tests/, ~30s to run, run automatically on every push via GitHub Actions) codifies every invariant discovered during this project:</w:t>
+        <w:t>A CI-enforced, 57-test regression suite (tests/, ~30s to run, run automatically on every push via GitHub Actions) codifies every invariant discovered during this project:</w:t>
       </w:r>
     </w:p>
     <w:p>
@@ -18801,7 +19735,7 @@
         <w:pStyle w:val="ListBullet"/>
       </w:pPr>
       <w:r>
-        <w:t>test_mmse_equalizer.py — genie MMSE never loses to No-Processing.</w:t>
+        <w:t>test_mmse_equalizer.py — genie MMSE never loses to No-Processing; ZF converges to MMSE as noise vanishes and recovers symbols near-perfectly at negligible noise (added alongside Section 4.10's ZF follow-up).</w:t>
       </w:r>
     </w:p>
     <w:p>
@@ -18830,7 +19764,7 @@
           <w:i w:val="0"/>
           <w:sz w:val="22"/>
         </w:rPr>
-        <w:t>Every experiment referenced in this report lives as a standalone Python script under experiments/ (e.g. run_case1_no_isi.py, run_case2_isi.py, run_severity_sweep.py, run_timevarying_channel.py, run_16qam_comparison.py, run_case1_boundary_loss.py, compute_cost_analysis.py, run_rls_comparison.py, diagnose_lms_nlms_asymmetry.py, diagnose_cnn_high_snr_floor.py, diagnose_training_variance.py), with shared logic in src/ (signal_gen.py, channel.py, lms_filter.py, nlms_filter.py, rls_filter.py, mmse_equalizer.py, utils.py, metrics.py) and a CNN-specific module (cnn_boundary_aware.py). Raw results are stored as CSVs under results/tables/ and figures under results/figures/, organized by case study. This report is the complete, self-contained writeup of that codebase's methodology, results, and conclusions.</w:t>
+        <w:t>Every experiment referenced in this report lives as a standalone Python script under experiments/ (e.g. run_case1_no_isi.py, run_case2_isi.py, run_severity_sweep.py, run_timevarying_channel.py, run_16qam_comparison.py, run_case1_boundary_loss.py, compute_cost_analysis.py, run_rls_comparison.py, run_zf_comparison.py, diagnose_lms_nlms_asymmetry.py, diagnose_cnn_high_snr_floor.py, diagnose_training_variance.py, test_nlms_floor_intervention.py, test_cnn_overlap_weighting_intervention.py), with shared logic in src/ (signal_gen.py, channel.py, lms_filter.py, nlms_filter.py, rls_filter.py, mmse_equalizer.py, utils.py, metrics.py) and a CNN-specific module (cnn_boundary_aware.py). Raw results are stored as CSVs under results/tables/ and figures under results/figures/, organized by case study. This report is the complete, self-contained writeup of that codebase's methodology, results, and conclusions.</w:t>
       </w:r>
     </w:p>
     <w:sectPr>

</xml_diff>

<commit_message>
Polish README overview and trim meta-noise from the report
README: add clickable links to report files, a table of contents, an
author credit, and the experiment scripts (ZF comparison, NLMS floor
intervention/sensitivity, CNN overlap-weighting intervention) that were
missing from Quick Start and Project Structure.

Report/Word doc: remove the "document formatting and structure guidance"
reference list (style-guide/blog sources about how to format a title
page) from the References section in both report.md and the generated
Word report -- meta-noise that doesn't belong next to real technical
citations and added nothing for a reader evaluating the actual findings.

Co-Authored-By: Claude Sonnet 5 <noreply@anthropic.com>
</commit_message>
<xml_diff>
--- a/report/SDR_Denoising_Project_Report.docx
+++ b/report/SDR_Denoising_Project_Report.docx
@@ -19738,19 +19738,7 @@
           <w:i w:val="0"/>
           <w:sz w:val="22"/>
         </w:rPr>
-        <w:t>All findings, numbers, tables, and figures elsewhere in this report are this project's own original results. The technical sources below ([1]-[6]) are cited by number at the specific claims they support in Section 9.5; they were used only to contextualize how this project's own measurements compare to prior published work, never as a substitute for this project's own measurements. A second, separate list credits sources consulted for this report's own formatting and structure (title page, abstract/executive-summary conventions) — these are not cited for any technical/numerical claim and are listed separately to avoid conflating the two.</w:t>
-      </w:r>
-    </w:p>
-    <w:p>
-      <w:pPr>
-        <w:pStyle w:val="Heading2"/>
-        <w:keepNext/>
-      </w:pPr>
-      <w:r>
-        <w:rPr>
-          <w:color w:val="1F3A5F"/>
-        </w:rPr>
-        <w:t>Technical literature (cited in Section 9.5)</w:t>
+        <w:t>All findings, numbers, tables, and figures elsewhere in this report are this project's own original results. The sources below are cited by number at the specific claims they support in Section 9.5; they were used only to contextualize how this project's own measurements compare to prior published work, never as a substitute for this project's own measurements.</w:t>
       </w:r>
     </w:p>
     <w:p>
@@ -19799,50 +19787,6 @@
       </w:pPr>
       <w:r>
         <w:t>Omdena, "Denoising Autoencoders," Omdena engineering blog, n.d.</w:t>
-      </w:r>
-    </w:p>
-    <w:p>
-      <w:pPr>
-        <w:pStyle w:val="Heading2"/>
-        <w:keepNext/>
-      </w:pPr>
-      <w:r>
-        <w:rPr>
-          <w:color w:val="1F3A5F"/>
-        </w:rPr>
-        <w:t>Document formatting and structure guidance (not cited for technical content)</w:t>
-      </w:r>
-    </w:p>
-    <w:p>
-      <w:pPr>
-        <w:pStyle w:val="ListBullet"/>
-      </w:pPr>
-      <w:r>
-        <w:t>IEEE Author Center, "Structure Your Article," IEEE Journals guidance, journals.ieeeauthorcenter.ieee.org, n.d.</w:t>
-      </w:r>
-    </w:p>
-    <w:p>
-      <w:pPr>
-        <w:pStyle w:val="ListBullet"/>
-      </w:pPr>
-      <w:r>
-        <w:t>Open Oregon Educational Resources, "10.3 Abstract and Executive Summary," Technical Writing (open textbook), openoregon.pressbooks.pub, n.d.</w:t>
-      </w:r>
-    </w:p>
-    <w:p>
-      <w:pPr>
-        <w:pStyle w:val="ListBullet"/>
-      </w:pPr>
-      <w:r>
-        <w:t>Scribbr, "Thesis &amp; Dissertation Title Page," scribbr.com, n.d.</w:t>
-      </w:r>
-    </w:p>
-    <w:p>
-      <w:pPr>
-        <w:pStyle w:val="ListBullet"/>
-      </w:pPr>
-      <w:r>
-        <w:t>Simon Fraser University Library, "Formatting Your Thesis: Title Page," lib.sfu.ca, n.d.</w:t>
       </w:r>
     </w:p>
     <w:p>

</xml_diff>